<commit_message>
Embed SPK v1 payment ledger into Chapter 5 DOCX automatically.
Inject contracts, live metrics, 21-row payment table, and operator cycles from runtime evidence so thesis export needs no manual copy-paste.

Co-authored-by: Cursor <cursoragent@cursor.com>
</commit_message>
<xml_diff>
--- a/thesis_package/output/THESIS_GROUNDED.docx
+++ b/thesis_package/output/THESIS_GROUNDED.docx
@@ -4733,13 +4733,19 @@
           </w:tcPr>
           <w:p>
             <w:pPr>
+              <w:ind w:firstLine="0"/>
               <w:jc w:val="center"/>
             </w:pPr>
-            <w:r/>
+            <w:r>
+              <w:rPr>
+                <w:sz w:val="18"/>
+              </w:rPr>
+            </w:r>
             <w:r>
               <w:rPr>
                 <w:b/>
                 <w:i w:val="0"/>
+                <w:sz w:val="18"/>
                 <w:u w:val="none"/>
               </w:rPr>
               <w:t>Location</w:t>
@@ -4752,13 +4758,19 @@
           </w:tcPr>
           <w:p>
             <w:pPr>
+              <w:ind w:firstLine="0"/>
               <w:jc w:val="center"/>
             </w:pPr>
-            <w:r/>
+            <w:r>
+              <w:rPr>
+                <w:sz w:val="18"/>
+              </w:rPr>
+            </w:r>
             <w:r>
               <w:rPr>
                 <w:b/>
                 <w:i w:val="0"/>
+                <w:sz w:val="18"/>
                 <w:u w:val="none"/>
               </w:rPr>
               <w:t>S0 ($/kWh)</w:t>
@@ -4771,13 +4783,19 @@
           </w:tcPr>
           <w:p>
             <w:pPr>
+              <w:ind w:firstLine="0"/>
               <w:jc w:val="center"/>
             </w:pPr>
-            <w:r/>
+            <w:r>
+              <w:rPr>
+                <w:sz w:val="18"/>
+              </w:rPr>
+            </w:r>
             <w:r>
               <w:rPr>
                 <w:b/>
                 <w:i w:val="0"/>
+                <w:sz w:val="18"/>
                 <w:u w:val="none"/>
               </w:rPr>
               <w:t>Sigma</w:t>
@@ -4790,13 +4808,19 @@
           </w:tcPr>
           <w:p>
             <w:pPr>
+              <w:ind w:firstLine="0"/>
               <w:jc w:val="center"/>
             </w:pPr>
-            <w:r/>
+            <w:r>
+              <w:rPr>
+                <w:sz w:val="18"/>
+              </w:rPr>
+            </w:r>
             <w:r>
               <w:rPr>
                 <w:b/>
                 <w:i w:val="0"/>
+                <w:sz w:val="18"/>
                 <w:u w:val="none"/>
               </w:rPr>
               <w:t>Binomial Call</w:t>
@@ -4809,13 +4833,19 @@
           </w:tcPr>
           <w:p>
             <w:pPr>
+              <w:ind w:firstLine="0"/>
               <w:jc w:val="center"/>
             </w:pPr>
-            <w:r/>
+            <w:r>
+              <w:rPr>
+                <w:sz w:val="18"/>
+              </w:rPr>
+            </w:r>
             <w:r>
               <w:rPr>
                 <w:b/>
                 <w:i w:val="0"/>
+                <w:sz w:val="18"/>
                 <w:u w:val="none"/>
               </w:rPr>
               <w:t>Monte Carlo Call</w:t>
@@ -4828,13 +4858,19 @@
           </w:tcPr>
           <w:p>
             <w:pPr>
+              <w:ind w:firstLine="0"/>
               <w:jc w:val="center"/>
             </w:pPr>
-            <w:r/>
+            <w:r>
+              <w:rPr>
+                <w:sz w:val="18"/>
+              </w:rPr>
+            </w:r>
             <w:r>
               <w:rPr>
                 <w:b/>
                 <w:i w:val="0"/>
+                <w:sz w:val="18"/>
                 <w:u w:val="none"/>
               </w:rPr>
               <w:t>Interpretation</w:t>
@@ -4848,11 +4884,19 @@
             <w:tcW w:type="dxa" w:w="1560"/>
           </w:tcPr>
           <w:p>
-            <w:r/>
+            <w:pPr>
+              <w:ind w:firstLine="0"/>
+            </w:pPr>
+            <w:r>
+              <w:rPr>
+                <w:sz w:val="18"/>
+              </w:rPr>
+            </w:r>
             <w:r>
               <w:rPr>
                 <w:b w:val="0"/>
                 <w:i w:val="0"/>
+                <w:sz w:val="18"/>
                 <w:u w:val="none"/>
               </w:rPr>
               <w:t>Germany</w:t>
@@ -4864,11 +4908,19 @@
             <w:tcW w:type="dxa" w:w="1560"/>
           </w:tcPr>
           <w:p>
-            <w:r/>
+            <w:pPr>
+              <w:ind w:firstLine="0"/>
+            </w:pPr>
+            <w:r>
+              <w:rPr>
+                <w:sz w:val="18"/>
+              </w:rPr>
+            </w:r>
             <w:r>
               <w:rPr>
                 <w:b w:val="0"/>
                 <w:i w:val="0"/>
+                <w:sz w:val="18"/>
                 <w:u w:val="none"/>
               </w:rPr>
               <w:t>0.0250</w:t>
@@ -4880,11 +4932,19 @@
             <w:tcW w:type="dxa" w:w="1560"/>
           </w:tcPr>
           <w:p>
-            <w:r/>
+            <w:pPr>
+              <w:ind w:firstLine="0"/>
+            </w:pPr>
+            <w:r>
+              <w:rPr>
+                <w:sz w:val="18"/>
+              </w:rPr>
+            </w:r>
             <w:r>
               <w:rPr>
                 <w:b w:val="0"/>
                 <w:i w:val="0"/>
+                <w:sz w:val="18"/>
                 <w:u w:val="none"/>
               </w:rPr>
               <w:t>45%</w:t>
@@ -4896,11 +4956,19 @@
             <w:tcW w:type="dxa" w:w="1560"/>
           </w:tcPr>
           <w:p>
-            <w:r/>
+            <w:pPr>
+              <w:ind w:firstLine="0"/>
+            </w:pPr>
+            <w:r>
+              <w:rPr>
+                <w:sz w:val="18"/>
+              </w:rPr>
+            </w:r>
             <w:r>
               <w:rPr>
                 <w:b w:val="0"/>
                 <w:i w:val="0"/>
+                <w:sz w:val="18"/>
                 <w:u w:val="none"/>
               </w:rPr>
               <w:t>0.000001</w:t>
@@ -4912,11 +4980,19 @@
             <w:tcW w:type="dxa" w:w="1560"/>
           </w:tcPr>
           <w:p>
-            <w:r/>
+            <w:pPr>
+              <w:ind w:firstLine="0"/>
+            </w:pPr>
+            <w:r>
+              <w:rPr>
+                <w:sz w:val="18"/>
+              </w:rPr>
+            </w:r>
             <w:r>
               <w:rPr>
                 <w:b w:val="0"/>
                 <w:i w:val="0"/>
+                <w:sz w:val="18"/>
                 <w:u w:val="none"/>
               </w:rPr>
               <w:t>0.0000009</w:t>
@@ -4928,11 +5004,19 @@
             <w:tcW w:type="dxa" w:w="1560"/>
           </w:tcPr>
           <w:p>
-            <w:r/>
+            <w:pPr>
+              <w:ind w:firstLine="0"/>
+            </w:pPr>
+            <w:r>
+              <w:rPr>
+                <w:sz w:val="18"/>
+              </w:rPr>
+            </w:r>
             <w:r>
               <w:rPr>
                 <w:b w:val="0"/>
                 <w:i w:val="0"/>
+                <w:sz w:val="18"/>
                 <w:u w:val="none"/>
               </w:rPr>
               <w:t>Near-zero option value in this convergence run; relative difference inflated by tiny base.</w:t>
@@ -4946,11 +5030,19 @@
             <w:tcW w:type="dxa" w:w="1560"/>
           </w:tcPr>
           <w:p>
-            <w:r/>
+            <w:pPr>
+              <w:ind w:firstLine="0"/>
+            </w:pPr>
+            <w:r>
+              <w:rPr>
+                <w:sz w:val="18"/>
+              </w:rPr>
+            </w:r>
             <w:r>
               <w:rPr>
                 <w:b w:val="0"/>
                 <w:i w:val="0"/>
+                <w:sz w:val="18"/>
                 <w:u w:val="none"/>
               </w:rPr>
               <w:t>Taiwan</w:t>
@@ -4962,11 +5054,19 @@
             <w:tcW w:type="dxa" w:w="1560"/>
           </w:tcPr>
           <w:p>
-            <w:r/>
+            <w:pPr>
+              <w:ind w:firstLine="0"/>
+            </w:pPr>
+            <w:r>
+              <w:rPr>
+                <w:sz w:val="18"/>
+              </w:rPr>
+            </w:r>
             <w:r>
               <w:rPr>
                 <w:b w:val="0"/>
                 <w:i w:val="0"/>
+                <w:sz w:val="18"/>
                 <w:u w:val="none"/>
               </w:rPr>
               <w:t>0.0525</w:t>
@@ -4978,11 +5078,19 @@
             <w:tcW w:type="dxa" w:w="1560"/>
           </w:tcPr>
           <w:p>
-            <w:r/>
+            <w:pPr>
+              <w:ind w:firstLine="0"/>
+            </w:pPr>
+            <w:r>
+              <w:rPr>
+                <w:sz w:val="18"/>
+              </w:rPr>
+            </w:r>
             <w:r>
               <w:rPr>
                 <w:b w:val="0"/>
                 <w:i w:val="0"/>
+                <w:sz w:val="18"/>
                 <w:u w:val="none"/>
               </w:rPr>
               <w:t>189%</w:t>
@@ -4994,11 +5102,19 @@
             <w:tcW w:type="dxa" w:w="1560"/>
           </w:tcPr>
           <w:p>
-            <w:r/>
+            <w:pPr>
+              <w:ind w:firstLine="0"/>
+            </w:pPr>
+            <w:r>
+              <w:rPr>
+                <w:sz w:val="18"/>
+              </w:rPr>
+            </w:r>
             <w:r>
               <w:rPr>
                 <w:b w:val="0"/>
                 <w:i w:val="0"/>
+                <w:sz w:val="18"/>
                 <w:u w:val="none"/>
               </w:rPr>
               <w:t>0.01917</w:t>
@@ -5010,11 +5126,19 @@
             <w:tcW w:type="dxa" w:w="1560"/>
           </w:tcPr>
           <w:p>
-            <w:r/>
+            <w:pPr>
+              <w:ind w:firstLine="0"/>
+            </w:pPr>
+            <w:r>
+              <w:rPr>
+                <w:sz w:val="18"/>
+              </w:rPr>
+            </w:r>
             <w:r>
               <w:rPr>
                 <w:b w:val="0"/>
                 <w:i w:val="0"/>
+                <w:sz w:val="18"/>
                 <w:u w:val="none"/>
               </w:rPr>
               <w:t>0.02025</w:t>
@@ -5026,11 +5150,19 @@
             <w:tcW w:type="dxa" w:w="1560"/>
           </w:tcPr>
           <w:p>
-            <w:r/>
+            <w:pPr>
+              <w:ind w:firstLine="0"/>
+            </w:pPr>
+            <w:r>
+              <w:rPr>
+                <w:sz w:val="18"/>
+              </w:rPr>
+            </w:r>
             <w:r>
               <w:rPr>
                 <w:b w:val="0"/>
                 <w:i w:val="0"/>
+                <w:sz w:val="18"/>
                 <w:u w:val="none"/>
               </w:rPr>
               <w:t>Main base case; convergence within about 5.6%.</w:t>
@@ -5044,11 +5176,19 @@
             <w:tcW w:type="dxa" w:w="1560"/>
           </w:tcPr>
           <w:p>
-            <w:r/>
+            <w:pPr>
+              <w:ind w:firstLine="0"/>
+            </w:pPr>
+            <w:r>
+              <w:rPr>
+                <w:sz w:val="18"/>
+              </w:rPr>
+            </w:r>
             <w:r>
               <w:rPr>
                 <w:b w:val="0"/>
                 <w:i w:val="0"/>
+                <w:sz w:val="18"/>
                 <w:u w:val="none"/>
               </w:rPr>
               <w:t>Saudi Arabia</w:t>
@@ -5060,11 +5200,19 @@
             <w:tcW w:type="dxa" w:w="1560"/>
           </w:tcPr>
           <w:p>
-            <w:r/>
+            <w:pPr>
+              <w:ind w:firstLine="0"/>
+            </w:pPr>
+            <w:r>
+              <w:rPr>
+                <w:sz w:val="18"/>
+              </w:rPr>
+            </w:r>
             <w:r>
               <w:rPr>
                 <w:b w:val="0"/>
                 <w:i w:val="0"/>
+                <w:sz w:val="18"/>
                 <w:u w:val="none"/>
               </w:rPr>
               <w:t>0.0550</w:t>
@@ -5076,11 +5224,19 @@
             <w:tcW w:type="dxa" w:w="1560"/>
           </w:tcPr>
           <w:p>
-            <w:r/>
+            <w:pPr>
+              <w:ind w:firstLine="0"/>
+            </w:pPr>
+            <w:r>
+              <w:rPr>
+                <w:sz w:val="18"/>
+              </w:rPr>
+            </w:r>
             <w:r>
               <w:rPr>
                 <w:b w:val="0"/>
                 <w:i w:val="0"/>
+                <w:sz w:val="18"/>
                 <w:u w:val="none"/>
               </w:rPr>
               <w:t>172%</w:t>
@@ -5092,11 +5248,19 @@
             <w:tcW w:type="dxa" w:w="1560"/>
           </w:tcPr>
           <w:p>
-            <w:r/>
+            <w:pPr>
+              <w:ind w:firstLine="0"/>
+            </w:pPr>
+            <w:r>
+              <w:rPr>
+                <w:sz w:val="18"/>
+              </w:rPr>
+            </w:r>
             <w:r>
               <w:rPr>
                 <w:b w:val="0"/>
                 <w:i w:val="0"/>
+                <w:sz w:val="18"/>
                 <w:u w:val="none"/>
               </w:rPr>
               <w:t>0.01929</w:t>
@@ -5108,11 +5272,19 @@
             <w:tcW w:type="dxa" w:w="1560"/>
           </w:tcPr>
           <w:p>
-            <w:r/>
+            <w:pPr>
+              <w:ind w:firstLine="0"/>
+            </w:pPr>
+            <w:r>
+              <w:rPr>
+                <w:sz w:val="18"/>
+              </w:rPr>
+            </w:r>
             <w:r>
               <w:rPr>
                 <w:b w:val="0"/>
                 <w:i w:val="0"/>
+                <w:sz w:val="18"/>
                 <w:u w:val="none"/>
               </w:rPr>
               <w:t>0.01945</w:t>
@@ -5124,11 +5296,19 @@
             <w:tcW w:type="dxa" w:w="1560"/>
           </w:tcPr>
           <w:p>
-            <w:r/>
+            <w:pPr>
+              <w:ind w:firstLine="0"/>
+            </w:pPr>
+            <w:r>
+              <w:rPr>
+                <w:sz w:val="18"/>
+              </w:rPr>
+            </w:r>
             <w:r>
               <w:rPr>
                 <w:b w:val="0"/>
                 <w:i w:val="0"/>
+                <w:sz w:val="18"/>
                 <w:u w:val="none"/>
               </w:rPr>
               <w:t>Strong convergence.</w:t>
@@ -5142,11 +5322,19 @@
             <w:tcW w:type="dxa" w:w="1560"/>
           </w:tcPr>
           <w:p>
-            <w:r/>
+            <w:pPr>
+              <w:ind w:firstLine="0"/>
+            </w:pPr>
+            <w:r>
+              <w:rPr>
+                <w:sz w:val="18"/>
+              </w:rPr>
+            </w:r>
             <w:r>
               <w:rPr>
                 <w:b w:val="0"/>
                 <w:i w:val="0"/>
+                <w:sz w:val="18"/>
                 <w:u w:val="none"/>
               </w:rPr>
               <w:t>Arizona</w:t>
@@ -5158,11 +5346,19 @@
             <w:tcW w:type="dxa" w:w="1560"/>
           </w:tcPr>
           <w:p>
-            <w:r/>
+            <w:pPr>
+              <w:ind w:firstLine="0"/>
+            </w:pPr>
+            <w:r>
+              <w:rPr>
+                <w:sz w:val="18"/>
+              </w:rPr>
+            </w:r>
             <w:r>
               <w:rPr>
                 <w:b w:val="0"/>
                 <w:i w:val="0"/>
+                <w:sz w:val="18"/>
                 <w:u w:val="none"/>
               </w:rPr>
               <w:t>0.0580</w:t>
@@ -5174,11 +5370,19 @@
             <w:tcW w:type="dxa" w:w="1560"/>
           </w:tcPr>
           <w:p>
-            <w:r/>
+            <w:pPr>
+              <w:ind w:firstLine="0"/>
+            </w:pPr>
+            <w:r>
+              <w:rPr>
+                <w:sz w:val="18"/>
+              </w:rPr>
+            </w:r>
             <w:r>
               <w:rPr>
                 <w:b w:val="0"/>
                 <w:i w:val="0"/>
+                <w:sz w:val="18"/>
                 <w:u w:val="none"/>
               </w:rPr>
               <w:t>165%</w:t>
@@ -5190,11 +5394,19 @@
             <w:tcW w:type="dxa" w:w="1560"/>
           </w:tcPr>
           <w:p>
-            <w:r/>
+            <w:pPr>
+              <w:ind w:firstLine="0"/>
+            </w:pPr>
+            <w:r>
+              <w:rPr>
+                <w:sz w:val="18"/>
+              </w:rPr>
+            </w:r>
             <w:r>
               <w:rPr>
                 <w:b w:val="0"/>
                 <w:i w:val="0"/>
+                <w:sz w:val="18"/>
                 <w:u w:val="none"/>
               </w:rPr>
               <w:t>0.02068</w:t>
@@ -5206,11 +5418,19 @@
             <w:tcW w:type="dxa" w:w="1560"/>
           </w:tcPr>
           <w:p>
-            <w:r/>
+            <w:pPr>
+              <w:ind w:firstLine="0"/>
+            </w:pPr>
+            <w:r>
+              <w:rPr>
+                <w:sz w:val="18"/>
+              </w:rPr>
+            </w:r>
             <w:r>
               <w:rPr>
                 <w:b w:val="0"/>
                 <w:i w:val="0"/>
+                <w:sz w:val="18"/>
                 <w:u w:val="none"/>
               </w:rPr>
               <w:t>0.02100</w:t>
@@ -5222,11 +5442,19 @@
             <w:tcW w:type="dxa" w:w="1560"/>
           </w:tcPr>
           <w:p>
-            <w:r/>
+            <w:pPr>
+              <w:ind w:firstLine="0"/>
+            </w:pPr>
+            <w:r>
+              <w:rPr>
+                <w:sz w:val="18"/>
+              </w:rPr>
+            </w:r>
             <w:r>
               <w:rPr>
                 <w:b w:val="0"/>
                 <w:i w:val="0"/>
+                <w:sz w:val="18"/>
                 <w:u w:val="none"/>
               </w:rPr>
               <w:t>Strong convergence.</w:t>
@@ -5240,11 +5468,19 @@
             <w:tcW w:type="dxa" w:w="1560"/>
           </w:tcPr>
           <w:p>
-            <w:r/>
+            <w:pPr>
+              <w:ind w:firstLine="0"/>
+            </w:pPr>
+            <w:r>
+              <w:rPr>
+                <w:sz w:val="18"/>
+              </w:rPr>
+            </w:r>
             <w:r>
               <w:rPr>
                 <w:b w:val="0"/>
                 <w:i w:val="0"/>
+                <w:sz w:val="18"/>
                 <w:u w:val="none"/>
               </w:rPr>
               <w:t>Brazil</w:t>
@@ -5256,11 +5492,19 @@
             <w:tcW w:type="dxa" w:w="1560"/>
           </w:tcPr>
           <w:p>
-            <w:r/>
+            <w:pPr>
+              <w:ind w:firstLine="0"/>
+            </w:pPr>
+            <w:r>
+              <w:rPr>
+                <w:sz w:val="18"/>
+              </w:rPr>
+            </w:r>
             <w:r>
               <w:rPr>
                 <w:b w:val="0"/>
                 <w:i w:val="0"/>
+                <w:sz w:val="18"/>
                 <w:u w:val="none"/>
               </w:rPr>
               <w:t>0.0950</w:t>
@@ -5272,11 +5516,19 @@
             <w:tcW w:type="dxa" w:w="1560"/>
           </w:tcPr>
           <w:p>
-            <w:r/>
+            <w:pPr>
+              <w:ind w:firstLine="0"/>
+            </w:pPr>
+            <w:r>
+              <w:rPr>
+                <w:sz w:val="18"/>
+              </w:rPr>
+            </w:r>
             <w:r>
               <w:rPr>
                 <w:b w:val="0"/>
                 <w:i w:val="0"/>
+                <w:sz w:val="18"/>
                 <w:u w:val="none"/>
               </w:rPr>
               <w:t>198%</w:t>
@@ -5288,11 +5540,19 @@
             <w:tcW w:type="dxa" w:w="1560"/>
           </w:tcPr>
           <w:p>
-            <w:r/>
+            <w:pPr>
+              <w:ind w:firstLine="0"/>
+            </w:pPr>
+            <w:r>
+              <w:rPr>
+                <w:sz w:val="18"/>
+              </w:rPr>
+            </w:r>
             <w:r>
               <w:rPr>
                 <w:b w:val="0"/>
                 <w:i w:val="0"/>
+                <w:sz w:val="18"/>
                 <w:u w:val="none"/>
               </w:rPr>
               <w:t>0.05373</w:t>
@@ -5304,11 +5564,19 @@
             <w:tcW w:type="dxa" w:w="1560"/>
           </w:tcPr>
           <w:p>
-            <w:r/>
+            <w:pPr>
+              <w:ind w:firstLine="0"/>
+            </w:pPr>
+            <w:r>
+              <w:rPr>
+                <w:sz w:val="18"/>
+              </w:rPr>
+            </w:r>
             <w:r>
               <w:rPr>
                 <w:b w:val="0"/>
                 <w:i w:val="0"/>
+                <w:sz w:val="18"/>
                 <w:u w:val="none"/>
               </w:rPr>
               <w:t>0.05449</w:t>
@@ -5320,11 +5588,19 @@
             <w:tcW w:type="dxa" w:w="1560"/>
           </w:tcPr>
           <w:p>
-            <w:r/>
+            <w:pPr>
+              <w:ind w:firstLine="0"/>
+            </w:pPr>
+            <w:r>
+              <w:rPr>
+                <w:sz w:val="18"/>
+              </w:rPr>
+            </w:r>
             <w:r>
               <w:rPr>
                 <w:b w:val="0"/>
                 <w:i w:val="0"/>
+                <w:sz w:val="18"/>
                 <w:u w:val="none"/>
               </w:rPr>
               <w:t>Strong convergence.</w:t>
@@ -8642,25 +8918,7 @@
           <w:i w:val="0"/>
           <w:u w:val="none"/>
         </w:rPr>
-        <w:t xml:space="preserve">Table 5.3 summarises the main public SPK v1 evidence (full ledger: </w:t>
-      </w:r>
-      <w:r>
-        <w:rPr>
-          <w:rFonts w:ascii="Courier New" w:hAnsi="Courier New"/>
-          <w:b w:val="0"/>
-          <w:i w:val="0"/>
-          <w:sz w:val="21"/>
-          <w:u w:val="none"/>
-        </w:rPr>
-        <w:t>thesis_package/SPK_V1_EVIDENCE.md</w:t>
-      </w:r>
-      <w:r>
-        <w:rPr>
-          <w:b w:val="0"/>
-          <w:i w:val="0"/>
-          <w:u w:val="none"/>
-        </w:rPr>
-        <w:t>).</w:t>
+        <w:t>Table 5.3 summarises the main public SPK v1 evidence (Table 5.4 and §5.10.1–5.10.3 below; regenerated on each thesis build).</w:t>
       </w:r>
     </w:p>
     <w:tbl>
@@ -9037,6 +9295,4104 @@
           <w:u w:val="none"/>
         </w:rPr>
         <w:t xml:space="preserve"> for this chapter is now the SPK v1 runtime and its on-chain payment history.</w:t>
+      </w:r>
+    </w:p>
+    <w:p>
+      <w:r>
+        <w:rPr>
+          <w:b w:val="0"/>
+          <w:i/>
+          <w:u w:val="none"/>
+        </w:rPr>
+        <w:t xml:space="preserve">The following blocks are exported from </w:t>
+      </w:r>
+      <w:r>
+        <w:rPr>
+          <w:rFonts w:ascii="Courier New" w:hAnsi="Courier New"/>
+          <w:b w:val="0"/>
+          <w:i/>
+          <w:sz w:val="21"/>
+          <w:u w:val="none"/>
+        </w:rPr>
+        <w:t>state/runtime/spk_v1.json</w:t>
+      </w:r>
+      <w:r>
+        <w:rPr>
+          <w:b w:val="0"/>
+          <w:i/>
+          <w:u w:val="none"/>
+        </w:rPr>
+        <w:t xml:space="preserve"> after Sepolia sync (Generated:** 2026-06-09T09:53:51.664666+00:00).</w:t>
+      </w:r>
+    </w:p>
+    <w:p>
+      <w:pPr>
+        <w:pStyle w:val="Heading2"/>
+      </w:pPr>
+      <w:r>
+        <w:t>5.10.1 Canonical contracts and live metrics</w:t>
+      </w:r>
+    </w:p>
+    <w:tbl>
+      <w:tblPr>
+        <w:tblStyle w:val="TableGrid"/>
+        <w:tblW w:type="auto" w:w="0"/>
+        <w:tblLook w:firstColumn="1" w:firstRow="1" w:lastColumn="0" w:lastRow="0" w:noHBand="0" w:noVBand="1" w:val="04A0"/>
+      </w:tblPr>
+      <w:tblGrid>
+        <w:gridCol w:w="4680"/>
+        <w:gridCol w:w="4680"/>
+      </w:tblGrid>
+      <w:tr>
+        <w:tc>
+          <w:tcPr>
+            <w:tcW w:type="dxa" w:w="4680"/>
+          </w:tcPr>
+          <w:p>
+            <w:pPr>
+              <w:jc w:val="center"/>
+            </w:pPr>
+            <w:r/>
+            <w:r>
+              <w:rPr>
+                <w:b/>
+                <w:i w:val="0"/>
+                <w:u w:val="none"/>
+              </w:rPr>
+              <w:t>Contract</w:t>
+            </w:r>
+          </w:p>
+        </w:tc>
+        <w:tc>
+          <w:tcPr>
+            <w:tcW w:type="dxa" w:w="4680"/>
+          </w:tcPr>
+          <w:p>
+            <w:pPr>
+              <w:jc w:val="center"/>
+            </w:pPr>
+            <w:r/>
+            <w:r>
+              <w:rPr>
+                <w:b/>
+                <w:i w:val="0"/>
+                <w:u w:val="none"/>
+              </w:rPr>
+              <w:t>Address</w:t>
+            </w:r>
+          </w:p>
+        </w:tc>
+      </w:tr>
+      <w:tr>
+        <w:tc>
+          <w:tcPr>
+            <w:tcW w:type="dxa" w:w="4680"/>
+          </w:tcPr>
+          <w:p>
+            <w:r/>
+            <w:r>
+              <w:rPr>
+                <w:b w:val="0"/>
+                <w:i w:val="0"/>
+                <w:u w:val="none"/>
+              </w:rPr>
+              <w:t>mock_usdc</w:t>
+            </w:r>
+          </w:p>
+        </w:tc>
+        <w:tc>
+          <w:tcPr>
+            <w:tcW w:type="dxa" w:w="4680"/>
+          </w:tcPr>
+          <w:p>
+            <w:r/>
+            <w:r>
+              <w:rPr>
+                <w:rFonts w:ascii="Courier New" w:hAnsi="Courier New"/>
+                <w:b w:val="0"/>
+                <w:i w:val="0"/>
+                <w:sz w:val="21"/>
+                <w:u w:val="none"/>
+              </w:rPr>
+              <w:t>0xaD2A7169CfFBA9Bef8C45515fc85178DbBfEc2C9</w:t>
+            </w:r>
+          </w:p>
+        </w:tc>
+      </w:tr>
+      <w:tr>
+        <w:tc>
+          <w:tcPr>
+            <w:tcW w:type="dxa" w:w="4680"/>
+          </w:tcPr>
+          <w:p>
+            <w:r/>
+            <w:r>
+              <w:rPr>
+                <w:b w:val="0"/>
+                <w:i w:val="0"/>
+                <w:u w:val="none"/>
+              </w:rPr>
+              <w:t>solar_punk_coin</w:t>
+            </w:r>
+          </w:p>
+        </w:tc>
+        <w:tc>
+          <w:tcPr>
+            <w:tcW w:type="dxa" w:w="4680"/>
+          </w:tcPr>
+          <w:p>
+            <w:r/>
+            <w:r>
+              <w:rPr>
+                <w:rFonts w:ascii="Courier New" w:hAnsi="Courier New"/>
+                <w:b w:val="0"/>
+                <w:i w:val="0"/>
+                <w:sz w:val="21"/>
+                <w:u w:val="none"/>
+              </w:rPr>
+              <w:t>0x8e189002228Fd4C6fA7611bA49FBe1d9C3412128</w:t>
+            </w:r>
+          </w:p>
+        </w:tc>
+      </w:tr>
+      <w:tr>
+        <w:tc>
+          <w:tcPr>
+            <w:tcW w:type="dxa" w:w="4680"/>
+          </w:tcPr>
+          <w:p>
+            <w:r/>
+            <w:r>
+              <w:rPr>
+                <w:b w:val="0"/>
+                <w:i w:val="0"/>
+                <w:u w:val="none"/>
+              </w:rPr>
+              <w:t>currency_system</w:t>
+            </w:r>
+          </w:p>
+        </w:tc>
+        <w:tc>
+          <w:tcPr>
+            <w:tcW w:type="dxa" w:w="4680"/>
+          </w:tcPr>
+          <w:p>
+            <w:r/>
+            <w:r>
+              <w:rPr>
+                <w:rFonts w:ascii="Courier New" w:hAnsi="Courier New"/>
+                <w:b w:val="0"/>
+                <w:i w:val="0"/>
+                <w:sz w:val="21"/>
+                <w:u w:val="none"/>
+              </w:rPr>
+              <w:t>0x520162252F9B94824417678525FFd69145014970</w:t>
+            </w:r>
+          </w:p>
+        </w:tc>
+      </w:tr>
+    </w:tbl>
+    <w:p/>
+    <w:p>
+      <w:pPr>
+        <w:pStyle w:val="ListBullet"/>
+        <w:ind w:left="0" w:firstLine="0"/>
+      </w:pPr>
+      <w:r>
+        <w:rPr>
+          <w:b w:val="0"/>
+          <w:i w:val="0"/>
+          <w:u w:val="none"/>
+        </w:rPr>
+        <w:t xml:space="preserve">Total supply: </w:t>
+      </w:r>
+      <w:r>
+        <w:rPr>
+          <w:b/>
+          <w:i w:val="0"/>
+          <w:u w:val="none"/>
+        </w:rPr>
+        <w:t>5499.015 SPK</w:t>
+      </w:r>
+    </w:p>
+    <w:p>
+      <w:pPr>
+        <w:pStyle w:val="ListBullet"/>
+        <w:ind w:left="0" w:firstLine="0"/>
+      </w:pPr>
+      <w:r>
+        <w:rPr>
+          <w:b w:val="0"/>
+          <w:i w:val="0"/>
+          <w:u w:val="none"/>
+        </w:rPr>
+        <w:t xml:space="preserve">Settled: </w:t>
+      </w:r>
+      <w:r>
+        <w:rPr>
+          <w:b/>
+          <w:i w:val="0"/>
+          <w:u w:val="none"/>
+        </w:rPr>
+        <w:t>442.0 SPK</w:t>
+      </w:r>
+    </w:p>
+    <w:p>
+      <w:pPr>
+        <w:pStyle w:val="ListBullet"/>
+        <w:ind w:left="0" w:firstLine="0"/>
+      </w:pPr>
+      <w:r>
+        <w:rPr>
+          <w:b w:val="0"/>
+          <w:i w:val="0"/>
+          <w:u w:val="none"/>
+        </w:rPr>
+        <w:t xml:space="preserve">Network payments: </w:t>
+      </w:r>
+      <w:r>
+        <w:rPr>
+          <w:b/>
+          <w:i w:val="0"/>
+          <w:u w:val="none"/>
+        </w:rPr>
+        <w:t>21</w:t>
+      </w:r>
+    </w:p>
+    <w:p>
+      <w:pPr>
+        <w:pStyle w:val="ListBullet"/>
+        <w:ind w:left="0" w:firstLine="0"/>
+      </w:pPr>
+      <w:r>
+        <w:rPr>
+          <w:b w:val="0"/>
+          <w:i w:val="0"/>
+          <w:u w:val="none"/>
+        </w:rPr>
+        <w:t xml:space="preserve">Circulation share: </w:t>
+      </w:r>
+      <w:r>
+        <w:rPr>
+          <w:b/>
+          <w:i w:val="0"/>
+          <w:u w:val="none"/>
+        </w:rPr>
+        <w:t>96.71%</w:t>
+      </w:r>
+    </w:p>
+    <w:p>
+      <w:pPr>
+        <w:pStyle w:val="Heading2"/>
+      </w:pPr>
+      <w:r>
+        <w:t>5.10.2 Indexed payment ledger (Table 5.4)</w:t>
+      </w:r>
+    </w:p>
+    <w:p>
+      <w:pPr>
+        <w:ind w:firstLine="0"/>
+        <w:jc w:val="center"/>
+      </w:pPr>
+      <w:r>
+        <w:rPr>
+          <w:b w:val="0"/>
+          <w:i w:val="0"/>
+          <w:u w:val="none"/>
+        </w:rPr>
+        <w:t xml:space="preserve">Table 5.4 lists all indexed </w:t>
+      </w:r>
+      <w:r>
+        <w:rPr>
+          <w:rFonts w:ascii="Courier New" w:hAnsi="Courier New"/>
+          <w:b w:val="0"/>
+          <w:i w:val="0"/>
+          <w:sz w:val="21"/>
+          <w:u w:val="none"/>
+        </w:rPr>
+        <w:t>settleNetworkPayment</w:t>
+      </w:r>
+      <w:r>
+        <w:rPr>
+          <w:b w:val="0"/>
+          <w:i w:val="0"/>
+          <w:u w:val="none"/>
+        </w:rPr>
+        <w:t xml:space="preserve"> events. Payment </w:t>
+      </w:r>
+      <w:r>
+        <w:rPr>
+          <w:b/>
+          <w:i w:val="0"/>
+          <w:u w:val="none"/>
+        </w:rPr>
+        <w:t>#15</w:t>
+      </w:r>
+      <w:r>
+        <w:rPr>
+          <w:b w:val="0"/>
+          <w:i w:val="0"/>
+          <w:u w:val="none"/>
+        </w:rPr>
+        <w:t xml:space="preserve"> is the wallet-initiated pilot transfer (Pilot payer → Merchant).</w:t>
+      </w:r>
+    </w:p>
+    <w:tbl>
+      <w:tblPr>
+        <w:tblStyle w:val="TableGrid"/>
+        <w:tblW w:type="auto" w:w="0"/>
+        <w:tblLook w:firstColumn="1" w:firstRow="1" w:lastColumn="0" w:lastRow="0" w:noHBand="0" w:noVBand="1" w:val="04A0"/>
+      </w:tblPr>
+      <w:tblGrid>
+        <w:gridCol w:w="1560"/>
+        <w:gridCol w:w="1560"/>
+        <w:gridCol w:w="1560"/>
+        <w:gridCol w:w="1560"/>
+        <w:gridCol w:w="1560"/>
+        <w:gridCol w:w="1560"/>
+      </w:tblGrid>
+      <w:tr>
+        <w:tc>
+          <w:tcPr>
+            <w:tcW w:type="dxa" w:w="1560"/>
+          </w:tcPr>
+          <w:p>
+            <w:pPr>
+              <w:ind w:firstLine="0"/>
+              <w:jc w:val="center"/>
+            </w:pPr>
+            <w:r>
+              <w:rPr>
+                <w:sz w:val="18"/>
+              </w:rPr>
+            </w:r>
+            <w:r>
+              <w:rPr>
+                <w:b/>
+                <w:i w:val="0"/>
+                <w:sz w:val="18"/>
+                <w:u w:val="none"/>
+              </w:rPr>
+              <w:t>#</w:t>
+            </w:r>
+          </w:p>
+        </w:tc>
+        <w:tc>
+          <w:tcPr>
+            <w:tcW w:type="dxa" w:w="1560"/>
+          </w:tcPr>
+          <w:p>
+            <w:pPr>
+              <w:ind w:firstLine="0"/>
+              <w:jc w:val="center"/>
+            </w:pPr>
+            <w:r>
+              <w:rPr>
+                <w:sz w:val="18"/>
+              </w:rPr>
+            </w:r>
+            <w:r>
+              <w:rPr>
+                <w:b/>
+                <w:i w:val="0"/>
+                <w:sz w:val="18"/>
+                <w:u w:val="none"/>
+              </w:rPr>
+              <w:t>Kind</w:t>
+            </w:r>
+          </w:p>
+        </w:tc>
+        <w:tc>
+          <w:tcPr>
+            <w:tcW w:type="dxa" w:w="1560"/>
+          </w:tcPr>
+          <w:p>
+            <w:pPr>
+              <w:ind w:firstLine="0"/>
+              <w:jc w:val="center"/>
+            </w:pPr>
+            <w:r>
+              <w:rPr>
+                <w:sz w:val="18"/>
+              </w:rPr>
+            </w:r>
+            <w:r>
+              <w:rPr>
+                <w:b/>
+                <w:i w:val="0"/>
+                <w:sz w:val="18"/>
+                <w:u w:val="none"/>
+              </w:rPr>
+              <w:t>SPK</w:t>
+            </w:r>
+          </w:p>
+        </w:tc>
+        <w:tc>
+          <w:tcPr>
+            <w:tcW w:type="dxa" w:w="1560"/>
+          </w:tcPr>
+          <w:p>
+            <w:pPr>
+              <w:ind w:firstLine="0"/>
+              <w:jc w:val="center"/>
+            </w:pPr>
+            <w:r>
+              <w:rPr>
+                <w:sz w:val="18"/>
+              </w:rPr>
+            </w:r>
+            <w:r>
+              <w:rPr>
+                <w:b/>
+                <w:i w:val="0"/>
+                <w:sz w:val="18"/>
+                <w:u w:val="none"/>
+              </w:rPr>
+              <w:t>Payee</w:t>
+            </w:r>
+          </w:p>
+        </w:tc>
+        <w:tc>
+          <w:tcPr>
+            <w:tcW w:type="dxa" w:w="1560"/>
+          </w:tcPr>
+          <w:p>
+            <w:pPr>
+              <w:ind w:firstLine="0"/>
+              <w:jc w:val="center"/>
+            </w:pPr>
+            <w:r>
+              <w:rPr>
+                <w:sz w:val="18"/>
+              </w:rPr>
+            </w:r>
+            <w:r>
+              <w:rPr>
+                <w:b/>
+                <w:i w:val="0"/>
+                <w:sz w:val="18"/>
+                <w:u w:val="none"/>
+              </w:rPr>
+              <w:t>Payer</w:t>
+            </w:r>
+          </w:p>
+        </w:tc>
+        <w:tc>
+          <w:tcPr>
+            <w:tcW w:type="dxa" w:w="1560"/>
+          </w:tcPr>
+          <w:p>
+            <w:pPr>
+              <w:ind w:firstLine="0"/>
+              <w:jc w:val="center"/>
+            </w:pPr>
+            <w:r>
+              <w:rPr>
+                <w:sz w:val="18"/>
+              </w:rPr>
+            </w:r>
+            <w:r>
+              <w:rPr>
+                <w:b/>
+                <w:i w:val="0"/>
+                <w:sz w:val="18"/>
+                <w:u w:val="none"/>
+              </w:rPr>
+              <w:t>Tx</w:t>
+            </w:r>
+          </w:p>
+        </w:tc>
+      </w:tr>
+      <w:tr>
+        <w:tc>
+          <w:tcPr>
+            <w:tcW w:type="dxa" w:w="1560"/>
+          </w:tcPr>
+          <w:p>
+            <w:pPr>
+              <w:ind w:firstLine="0"/>
+            </w:pPr>
+            <w:r>
+              <w:rPr>
+                <w:sz w:val="18"/>
+              </w:rPr>
+            </w:r>
+            <w:r>
+              <w:rPr>
+                <w:b w:val="0"/>
+                <w:i w:val="0"/>
+                <w:sz w:val="18"/>
+                <w:u w:val="none"/>
+              </w:rPr>
+              <w:t>1</w:t>
+            </w:r>
+          </w:p>
+        </w:tc>
+        <w:tc>
+          <w:tcPr>
+            <w:tcW w:type="dxa" w:w="1560"/>
+          </w:tcPr>
+          <w:p>
+            <w:pPr>
+              <w:ind w:firstLine="0"/>
+            </w:pPr>
+            <w:r>
+              <w:rPr>
+                <w:sz w:val="18"/>
+              </w:rPr>
+            </w:r>
+            <w:r>
+              <w:rPr>
+                <w:b w:val="0"/>
+                <w:i w:val="0"/>
+                <w:sz w:val="18"/>
+                <w:u w:val="none"/>
+              </w:rPr>
+              <w:t>SERVICE</w:t>
+            </w:r>
+          </w:p>
+        </w:tc>
+        <w:tc>
+          <w:tcPr>
+            <w:tcW w:type="dxa" w:w="1560"/>
+          </w:tcPr>
+          <w:p>
+            <w:pPr>
+              <w:ind w:firstLine="0"/>
+            </w:pPr>
+            <w:r>
+              <w:rPr>
+                <w:sz w:val="18"/>
+              </w:rPr>
+            </w:r>
+            <w:r>
+              <w:rPr>
+                <w:b w:val="0"/>
+                <w:i w:val="0"/>
+                <w:sz w:val="18"/>
+                <w:u w:val="none"/>
+              </w:rPr>
+              <w:t>12.0</w:t>
+            </w:r>
+          </w:p>
+        </w:tc>
+        <w:tc>
+          <w:tcPr>
+            <w:tcW w:type="dxa" w:w="1560"/>
+          </w:tcPr>
+          <w:p>
+            <w:pPr>
+              <w:ind w:firstLine="0"/>
+            </w:pPr>
+            <w:r>
+              <w:rPr>
+                <w:sz w:val="18"/>
+              </w:rPr>
+            </w:r>
+            <w:r>
+              <w:rPr>
+                <w:b w:val="0"/>
+                <w:i w:val="0"/>
+                <w:sz w:val="18"/>
+                <w:u w:val="none"/>
+              </w:rPr>
+              <w:t>Gateway</w:t>
+            </w:r>
+          </w:p>
+        </w:tc>
+        <w:tc>
+          <w:tcPr>
+            <w:tcW w:type="dxa" w:w="1560"/>
+          </w:tcPr>
+          <w:p>
+            <w:pPr>
+              <w:ind w:firstLine="0"/>
+            </w:pPr>
+            <w:r>
+              <w:rPr>
+                <w:sz w:val="18"/>
+              </w:rPr>
+            </w:r>
+            <w:r>
+              <w:rPr>
+                <w:b w:val="0"/>
+                <w:i w:val="0"/>
+                <w:sz w:val="18"/>
+                <w:u w:val="none"/>
+              </w:rPr>
+              <w:t>Operator</w:t>
+            </w:r>
+          </w:p>
+        </w:tc>
+        <w:tc>
+          <w:tcPr>
+            <w:tcW w:type="dxa" w:w="1560"/>
+          </w:tcPr>
+          <w:p>
+            <w:pPr>
+              <w:ind w:firstLine="0"/>
+            </w:pPr>
+            <w:r>
+              <w:rPr>
+                <w:sz w:val="18"/>
+              </w:rPr>
+            </w:r>
+            <w:r>
+              <w:rPr>
+                <w:b w:val="0"/>
+                <w:i w:val="0"/>
+                <w:sz w:val="18"/>
+                <w:u w:val="none"/>
+              </w:rPr>
+              <w:t>0x6c65e0ae…</w:t>
+            </w:r>
+          </w:p>
+        </w:tc>
+      </w:tr>
+      <w:tr>
+        <w:tc>
+          <w:tcPr>
+            <w:tcW w:type="dxa" w:w="1560"/>
+          </w:tcPr>
+          <w:p>
+            <w:pPr>
+              <w:ind w:firstLine="0"/>
+            </w:pPr>
+            <w:r>
+              <w:rPr>
+                <w:sz w:val="18"/>
+              </w:rPr>
+            </w:r>
+            <w:r>
+              <w:rPr>
+                <w:b w:val="0"/>
+                <w:i w:val="0"/>
+                <w:sz w:val="18"/>
+                <w:u w:val="none"/>
+              </w:rPr>
+              <w:t>2</w:t>
+            </w:r>
+          </w:p>
+        </w:tc>
+        <w:tc>
+          <w:tcPr>
+            <w:tcW w:type="dxa" w:w="1560"/>
+          </w:tcPr>
+          <w:p>
+            <w:pPr>
+              <w:ind w:firstLine="0"/>
+            </w:pPr>
+            <w:r>
+              <w:rPr>
+                <w:sz w:val="18"/>
+              </w:rPr>
+            </w:r>
+            <w:r>
+              <w:rPr>
+                <w:b w:val="0"/>
+                <w:i w:val="0"/>
+                <w:sz w:val="18"/>
+                <w:u w:val="none"/>
+              </w:rPr>
+              <w:t>LABOR</w:t>
+            </w:r>
+          </w:p>
+        </w:tc>
+        <w:tc>
+          <w:tcPr>
+            <w:tcW w:type="dxa" w:w="1560"/>
+          </w:tcPr>
+          <w:p>
+            <w:pPr>
+              <w:ind w:firstLine="0"/>
+            </w:pPr>
+            <w:r>
+              <w:rPr>
+                <w:sz w:val="18"/>
+              </w:rPr>
+            </w:r>
+            <w:r>
+              <w:rPr>
+                <w:b w:val="0"/>
+                <w:i w:val="0"/>
+                <w:sz w:val="18"/>
+                <w:u w:val="none"/>
+              </w:rPr>
+              <w:t>40.0</w:t>
+            </w:r>
+          </w:p>
+        </w:tc>
+        <w:tc>
+          <w:tcPr>
+            <w:tcW w:type="dxa" w:w="1560"/>
+          </w:tcPr>
+          <w:p>
+            <w:pPr>
+              <w:ind w:firstLine="0"/>
+            </w:pPr>
+            <w:r>
+              <w:rPr>
+                <w:sz w:val="18"/>
+              </w:rPr>
+            </w:r>
+            <w:r>
+              <w:rPr>
+                <w:b w:val="0"/>
+                <w:i w:val="0"/>
+                <w:sz w:val="18"/>
+                <w:u w:val="none"/>
+              </w:rPr>
+              <w:t>Maintenance</w:t>
+            </w:r>
+          </w:p>
+        </w:tc>
+        <w:tc>
+          <w:tcPr>
+            <w:tcW w:type="dxa" w:w="1560"/>
+          </w:tcPr>
+          <w:p>
+            <w:pPr>
+              <w:ind w:firstLine="0"/>
+            </w:pPr>
+            <w:r>
+              <w:rPr>
+                <w:sz w:val="18"/>
+              </w:rPr>
+            </w:r>
+            <w:r>
+              <w:rPr>
+                <w:b w:val="0"/>
+                <w:i w:val="0"/>
+                <w:sz w:val="18"/>
+                <w:u w:val="none"/>
+              </w:rPr>
+              <w:t>Operator</w:t>
+            </w:r>
+          </w:p>
+        </w:tc>
+        <w:tc>
+          <w:tcPr>
+            <w:tcW w:type="dxa" w:w="1560"/>
+          </w:tcPr>
+          <w:p>
+            <w:pPr>
+              <w:ind w:firstLine="0"/>
+            </w:pPr>
+            <w:r>
+              <w:rPr>
+                <w:sz w:val="18"/>
+              </w:rPr>
+            </w:r>
+            <w:r>
+              <w:rPr>
+                <w:b w:val="0"/>
+                <w:i w:val="0"/>
+                <w:sz w:val="18"/>
+                <w:u w:val="none"/>
+              </w:rPr>
+              <w:t>0x8ad9f3ce…</w:t>
+            </w:r>
+          </w:p>
+        </w:tc>
+      </w:tr>
+      <w:tr>
+        <w:tc>
+          <w:tcPr>
+            <w:tcW w:type="dxa" w:w="1560"/>
+          </w:tcPr>
+          <w:p>
+            <w:pPr>
+              <w:ind w:firstLine="0"/>
+            </w:pPr>
+            <w:r>
+              <w:rPr>
+                <w:sz w:val="18"/>
+              </w:rPr>
+            </w:r>
+            <w:r>
+              <w:rPr>
+                <w:b w:val="0"/>
+                <w:i w:val="0"/>
+                <w:sz w:val="18"/>
+                <w:u w:val="none"/>
+              </w:rPr>
+              <w:t>3</w:t>
+            </w:r>
+          </w:p>
+        </w:tc>
+        <w:tc>
+          <w:tcPr>
+            <w:tcW w:type="dxa" w:w="1560"/>
+          </w:tcPr>
+          <w:p>
+            <w:pPr>
+              <w:ind w:firstLine="0"/>
+            </w:pPr>
+            <w:r>
+              <w:rPr>
+                <w:sz w:val="18"/>
+              </w:rPr>
+            </w:r>
+            <w:r>
+              <w:rPr>
+                <w:b w:val="0"/>
+                <w:i w:val="0"/>
+                <w:sz w:val="18"/>
+                <w:u w:val="none"/>
+              </w:rPr>
+              <w:t>NETWORK</w:t>
+            </w:r>
+          </w:p>
+        </w:tc>
+        <w:tc>
+          <w:tcPr>
+            <w:tcW w:type="dxa" w:w="1560"/>
+          </w:tcPr>
+          <w:p>
+            <w:pPr>
+              <w:ind w:firstLine="0"/>
+            </w:pPr>
+            <w:r>
+              <w:rPr>
+                <w:sz w:val="18"/>
+              </w:rPr>
+            </w:r>
+            <w:r>
+              <w:rPr>
+                <w:b w:val="0"/>
+                <w:i w:val="0"/>
+                <w:sz w:val="18"/>
+                <w:u w:val="none"/>
+              </w:rPr>
+              <w:t>180.0</w:t>
+            </w:r>
+          </w:p>
+        </w:tc>
+        <w:tc>
+          <w:tcPr>
+            <w:tcW w:type="dxa" w:w="1560"/>
+          </w:tcPr>
+          <w:p>
+            <w:pPr>
+              <w:ind w:firstLine="0"/>
+            </w:pPr>
+            <w:r>
+              <w:rPr>
+                <w:sz w:val="18"/>
+              </w:rPr>
+            </w:r>
+            <w:r>
+              <w:rPr>
+                <w:b w:val="0"/>
+                <w:i w:val="0"/>
+                <w:sz w:val="18"/>
+                <w:u w:val="none"/>
+              </w:rPr>
+              <w:t>Operator</w:t>
+            </w:r>
+          </w:p>
+        </w:tc>
+        <w:tc>
+          <w:tcPr>
+            <w:tcW w:type="dxa" w:w="1560"/>
+          </w:tcPr>
+          <w:p>
+            <w:pPr>
+              <w:ind w:firstLine="0"/>
+            </w:pPr>
+            <w:r>
+              <w:rPr>
+                <w:sz w:val="18"/>
+              </w:rPr>
+            </w:r>
+            <w:r>
+              <w:rPr>
+                <w:b w:val="0"/>
+                <w:i w:val="0"/>
+                <w:sz w:val="18"/>
+                <w:u w:val="none"/>
+              </w:rPr>
+              <w:t>Operator</w:t>
+            </w:r>
+          </w:p>
+        </w:tc>
+        <w:tc>
+          <w:tcPr>
+            <w:tcW w:type="dxa" w:w="1560"/>
+          </w:tcPr>
+          <w:p>
+            <w:pPr>
+              <w:ind w:firstLine="0"/>
+            </w:pPr>
+            <w:r>
+              <w:rPr>
+                <w:sz w:val="18"/>
+              </w:rPr>
+            </w:r>
+            <w:r>
+              <w:rPr>
+                <w:b w:val="0"/>
+                <w:i w:val="0"/>
+                <w:sz w:val="18"/>
+                <w:u w:val="none"/>
+              </w:rPr>
+              <w:t>0x6dbbf639…</w:t>
+            </w:r>
+          </w:p>
+        </w:tc>
+      </w:tr>
+      <w:tr>
+        <w:tc>
+          <w:tcPr>
+            <w:tcW w:type="dxa" w:w="1560"/>
+          </w:tcPr>
+          <w:p>
+            <w:pPr>
+              <w:ind w:firstLine="0"/>
+            </w:pPr>
+            <w:r>
+              <w:rPr>
+                <w:sz w:val="18"/>
+              </w:rPr>
+            </w:r>
+            <w:r>
+              <w:rPr>
+                <w:b w:val="0"/>
+                <w:i w:val="0"/>
+                <w:sz w:val="18"/>
+                <w:u w:val="none"/>
+              </w:rPr>
+              <w:t>4</w:t>
+            </w:r>
+          </w:p>
+        </w:tc>
+        <w:tc>
+          <w:tcPr>
+            <w:tcW w:type="dxa" w:w="1560"/>
+          </w:tcPr>
+          <w:p>
+            <w:pPr>
+              <w:ind w:firstLine="0"/>
+            </w:pPr>
+            <w:r>
+              <w:rPr>
+                <w:sz w:val="18"/>
+              </w:rPr>
+            </w:r>
+            <w:r>
+              <w:rPr>
+                <w:b w:val="0"/>
+                <w:i w:val="0"/>
+                <w:sz w:val="18"/>
+                <w:u w:val="none"/>
+              </w:rPr>
+              <w:t>GOODS</w:t>
+            </w:r>
+          </w:p>
+        </w:tc>
+        <w:tc>
+          <w:tcPr>
+            <w:tcW w:type="dxa" w:w="1560"/>
+          </w:tcPr>
+          <w:p>
+            <w:pPr>
+              <w:ind w:firstLine="0"/>
+            </w:pPr>
+            <w:r>
+              <w:rPr>
+                <w:sz w:val="18"/>
+              </w:rPr>
+            </w:r>
+            <w:r>
+              <w:rPr>
+                <w:b w:val="0"/>
+                <w:i w:val="0"/>
+                <w:sz w:val="18"/>
+                <w:u w:val="none"/>
+              </w:rPr>
+              <w:t>55.0</w:t>
+            </w:r>
+          </w:p>
+        </w:tc>
+        <w:tc>
+          <w:tcPr>
+            <w:tcW w:type="dxa" w:w="1560"/>
+          </w:tcPr>
+          <w:p>
+            <w:pPr>
+              <w:ind w:firstLine="0"/>
+            </w:pPr>
+            <w:r>
+              <w:rPr>
+                <w:sz w:val="18"/>
+              </w:rPr>
+            </w:r>
+            <w:r>
+              <w:rPr>
+                <w:b w:val="0"/>
+                <w:i w:val="0"/>
+                <w:sz w:val="18"/>
+                <w:u w:val="none"/>
+              </w:rPr>
+              <w:t>Merchant</w:t>
+            </w:r>
+          </w:p>
+        </w:tc>
+        <w:tc>
+          <w:tcPr>
+            <w:tcW w:type="dxa" w:w="1560"/>
+          </w:tcPr>
+          <w:p>
+            <w:pPr>
+              <w:ind w:firstLine="0"/>
+            </w:pPr>
+            <w:r>
+              <w:rPr>
+                <w:sz w:val="18"/>
+              </w:rPr>
+            </w:r>
+            <w:r>
+              <w:rPr>
+                <w:b w:val="0"/>
+                <w:i w:val="0"/>
+                <w:sz w:val="18"/>
+                <w:u w:val="none"/>
+              </w:rPr>
+              <w:t>Operator</w:t>
+            </w:r>
+          </w:p>
+        </w:tc>
+        <w:tc>
+          <w:tcPr>
+            <w:tcW w:type="dxa" w:w="1560"/>
+          </w:tcPr>
+          <w:p>
+            <w:pPr>
+              <w:ind w:firstLine="0"/>
+            </w:pPr>
+            <w:r>
+              <w:rPr>
+                <w:sz w:val="18"/>
+              </w:rPr>
+            </w:r>
+            <w:r>
+              <w:rPr>
+                <w:b w:val="0"/>
+                <w:i w:val="0"/>
+                <w:sz w:val="18"/>
+                <w:u w:val="none"/>
+              </w:rPr>
+              <w:t>0x0d7e506b…</w:t>
+            </w:r>
+          </w:p>
+        </w:tc>
+      </w:tr>
+      <w:tr>
+        <w:tc>
+          <w:tcPr>
+            <w:tcW w:type="dxa" w:w="1560"/>
+          </w:tcPr>
+          <w:p>
+            <w:pPr>
+              <w:ind w:firstLine="0"/>
+            </w:pPr>
+            <w:r>
+              <w:rPr>
+                <w:sz w:val="18"/>
+              </w:rPr>
+            </w:r>
+            <w:r>
+              <w:rPr>
+                <w:b w:val="0"/>
+                <w:i w:val="0"/>
+                <w:sz w:val="18"/>
+                <w:u w:val="none"/>
+              </w:rPr>
+              <w:t>5</w:t>
+            </w:r>
+          </w:p>
+        </w:tc>
+        <w:tc>
+          <w:tcPr>
+            <w:tcW w:type="dxa" w:w="1560"/>
+          </w:tcPr>
+          <w:p>
+            <w:pPr>
+              <w:ind w:firstLine="0"/>
+            </w:pPr>
+            <w:r>
+              <w:rPr>
+                <w:sz w:val="18"/>
+              </w:rPr>
+            </w:r>
+            <w:r>
+              <w:rPr>
+                <w:b w:val="0"/>
+                <w:i w:val="0"/>
+                <w:sz w:val="18"/>
+                <w:u w:val="none"/>
+              </w:rPr>
+              <w:t>SERVICE</w:t>
+            </w:r>
+          </w:p>
+        </w:tc>
+        <w:tc>
+          <w:tcPr>
+            <w:tcW w:type="dxa" w:w="1560"/>
+          </w:tcPr>
+          <w:p>
+            <w:pPr>
+              <w:ind w:firstLine="0"/>
+            </w:pPr>
+            <w:r>
+              <w:rPr>
+                <w:sz w:val="18"/>
+              </w:rPr>
+            </w:r>
+            <w:r>
+              <w:rPr>
+                <w:b w:val="0"/>
+                <w:i w:val="0"/>
+                <w:sz w:val="18"/>
+                <w:u w:val="none"/>
+              </w:rPr>
+              <w:t>8.0</w:t>
+            </w:r>
+          </w:p>
+        </w:tc>
+        <w:tc>
+          <w:tcPr>
+            <w:tcW w:type="dxa" w:w="1560"/>
+          </w:tcPr>
+          <w:p>
+            <w:pPr>
+              <w:ind w:firstLine="0"/>
+            </w:pPr>
+            <w:r>
+              <w:rPr>
+                <w:sz w:val="18"/>
+              </w:rPr>
+            </w:r>
+            <w:r>
+              <w:rPr>
+                <w:b w:val="0"/>
+                <w:i w:val="0"/>
+                <w:sz w:val="18"/>
+                <w:u w:val="none"/>
+              </w:rPr>
+              <w:t>Gateway</w:t>
+            </w:r>
+          </w:p>
+        </w:tc>
+        <w:tc>
+          <w:tcPr>
+            <w:tcW w:type="dxa" w:w="1560"/>
+          </w:tcPr>
+          <w:p>
+            <w:pPr>
+              <w:ind w:firstLine="0"/>
+            </w:pPr>
+            <w:r>
+              <w:rPr>
+                <w:sz w:val="18"/>
+              </w:rPr>
+            </w:r>
+            <w:r>
+              <w:rPr>
+                <w:b w:val="0"/>
+                <w:i w:val="0"/>
+                <w:sz w:val="18"/>
+                <w:u w:val="none"/>
+              </w:rPr>
+              <w:t>Operator</w:t>
+            </w:r>
+          </w:p>
+        </w:tc>
+        <w:tc>
+          <w:tcPr>
+            <w:tcW w:type="dxa" w:w="1560"/>
+          </w:tcPr>
+          <w:p>
+            <w:pPr>
+              <w:ind w:firstLine="0"/>
+            </w:pPr>
+            <w:r>
+              <w:rPr>
+                <w:sz w:val="18"/>
+              </w:rPr>
+            </w:r>
+            <w:r>
+              <w:rPr>
+                <w:b w:val="0"/>
+                <w:i w:val="0"/>
+                <w:sz w:val="18"/>
+                <w:u w:val="none"/>
+              </w:rPr>
+              <w:t>0xeacc17a4…</w:t>
+            </w:r>
+          </w:p>
+        </w:tc>
+      </w:tr>
+      <w:tr>
+        <w:tc>
+          <w:tcPr>
+            <w:tcW w:type="dxa" w:w="1560"/>
+          </w:tcPr>
+          <w:p>
+            <w:pPr>
+              <w:ind w:firstLine="0"/>
+            </w:pPr>
+            <w:r>
+              <w:rPr>
+                <w:sz w:val="18"/>
+              </w:rPr>
+            </w:r>
+            <w:r>
+              <w:rPr>
+                <w:b w:val="0"/>
+                <w:i w:val="0"/>
+                <w:sz w:val="18"/>
+                <w:u w:val="none"/>
+              </w:rPr>
+              <w:t>6</w:t>
+            </w:r>
+          </w:p>
+        </w:tc>
+        <w:tc>
+          <w:tcPr>
+            <w:tcW w:type="dxa" w:w="1560"/>
+          </w:tcPr>
+          <w:p>
+            <w:pPr>
+              <w:ind w:firstLine="0"/>
+            </w:pPr>
+            <w:r>
+              <w:rPr>
+                <w:sz w:val="18"/>
+              </w:rPr>
+            </w:r>
+            <w:r>
+              <w:rPr>
+                <w:b w:val="0"/>
+                <w:i w:val="0"/>
+                <w:sz w:val="18"/>
+                <w:u w:val="none"/>
+              </w:rPr>
+              <w:t>GOODS</w:t>
+            </w:r>
+          </w:p>
+        </w:tc>
+        <w:tc>
+          <w:tcPr>
+            <w:tcW w:type="dxa" w:w="1560"/>
+          </w:tcPr>
+          <w:p>
+            <w:pPr>
+              <w:ind w:firstLine="0"/>
+            </w:pPr>
+            <w:r>
+              <w:rPr>
+                <w:sz w:val="18"/>
+              </w:rPr>
+            </w:r>
+            <w:r>
+              <w:rPr>
+                <w:b w:val="0"/>
+                <w:i w:val="0"/>
+                <w:sz w:val="18"/>
+                <w:u w:val="none"/>
+              </w:rPr>
+              <w:t>12.0</w:t>
+            </w:r>
+          </w:p>
+        </w:tc>
+        <w:tc>
+          <w:tcPr>
+            <w:tcW w:type="dxa" w:w="1560"/>
+          </w:tcPr>
+          <w:p>
+            <w:pPr>
+              <w:ind w:firstLine="0"/>
+            </w:pPr>
+            <w:r>
+              <w:rPr>
+                <w:sz w:val="18"/>
+              </w:rPr>
+            </w:r>
+            <w:r>
+              <w:rPr>
+                <w:b w:val="0"/>
+                <w:i w:val="0"/>
+                <w:sz w:val="18"/>
+                <w:u w:val="none"/>
+              </w:rPr>
+              <w:t>Merchant</w:t>
+            </w:r>
+          </w:p>
+        </w:tc>
+        <w:tc>
+          <w:tcPr>
+            <w:tcW w:type="dxa" w:w="1560"/>
+          </w:tcPr>
+          <w:p>
+            <w:pPr>
+              <w:ind w:firstLine="0"/>
+            </w:pPr>
+            <w:r>
+              <w:rPr>
+                <w:sz w:val="18"/>
+              </w:rPr>
+            </w:r>
+            <w:r>
+              <w:rPr>
+                <w:b w:val="0"/>
+                <w:i w:val="0"/>
+                <w:sz w:val="18"/>
+                <w:u w:val="none"/>
+              </w:rPr>
+              <w:t>Operator</w:t>
+            </w:r>
+          </w:p>
+        </w:tc>
+        <w:tc>
+          <w:tcPr>
+            <w:tcW w:type="dxa" w:w="1560"/>
+          </w:tcPr>
+          <w:p>
+            <w:pPr>
+              <w:ind w:firstLine="0"/>
+            </w:pPr>
+            <w:r>
+              <w:rPr>
+                <w:sz w:val="18"/>
+              </w:rPr>
+            </w:r>
+            <w:r>
+              <w:rPr>
+                <w:b w:val="0"/>
+                <w:i w:val="0"/>
+                <w:sz w:val="18"/>
+                <w:u w:val="none"/>
+              </w:rPr>
+              <w:t>0xb4972856…</w:t>
+            </w:r>
+          </w:p>
+        </w:tc>
+      </w:tr>
+      <w:tr>
+        <w:tc>
+          <w:tcPr>
+            <w:tcW w:type="dxa" w:w="1560"/>
+          </w:tcPr>
+          <w:p>
+            <w:pPr>
+              <w:ind w:firstLine="0"/>
+            </w:pPr>
+            <w:r>
+              <w:rPr>
+                <w:sz w:val="18"/>
+              </w:rPr>
+            </w:r>
+            <w:r>
+              <w:rPr>
+                <w:b w:val="0"/>
+                <w:i w:val="0"/>
+                <w:sz w:val="18"/>
+                <w:u w:val="none"/>
+              </w:rPr>
+              <w:t>7</w:t>
+            </w:r>
+          </w:p>
+        </w:tc>
+        <w:tc>
+          <w:tcPr>
+            <w:tcW w:type="dxa" w:w="1560"/>
+          </w:tcPr>
+          <w:p>
+            <w:pPr>
+              <w:ind w:firstLine="0"/>
+            </w:pPr>
+            <w:r>
+              <w:rPr>
+                <w:sz w:val="18"/>
+              </w:rPr>
+            </w:r>
+            <w:r>
+              <w:rPr>
+                <w:b w:val="0"/>
+                <w:i w:val="0"/>
+                <w:sz w:val="18"/>
+                <w:u w:val="none"/>
+              </w:rPr>
+              <w:t>SERVICE</w:t>
+            </w:r>
+          </w:p>
+        </w:tc>
+        <w:tc>
+          <w:tcPr>
+            <w:tcW w:type="dxa" w:w="1560"/>
+          </w:tcPr>
+          <w:p>
+            <w:pPr>
+              <w:ind w:firstLine="0"/>
+            </w:pPr>
+            <w:r>
+              <w:rPr>
+                <w:sz w:val="18"/>
+              </w:rPr>
+            </w:r>
+            <w:r>
+              <w:rPr>
+                <w:b w:val="0"/>
+                <w:i w:val="0"/>
+                <w:sz w:val="18"/>
+                <w:u w:val="none"/>
+              </w:rPr>
+              <w:t>6.0</w:t>
+            </w:r>
+          </w:p>
+        </w:tc>
+        <w:tc>
+          <w:tcPr>
+            <w:tcW w:type="dxa" w:w="1560"/>
+          </w:tcPr>
+          <w:p>
+            <w:pPr>
+              <w:ind w:firstLine="0"/>
+            </w:pPr>
+            <w:r>
+              <w:rPr>
+                <w:sz w:val="18"/>
+              </w:rPr>
+            </w:r>
+            <w:r>
+              <w:rPr>
+                <w:b w:val="0"/>
+                <w:i w:val="0"/>
+                <w:sz w:val="18"/>
+                <w:u w:val="none"/>
+              </w:rPr>
+              <w:t>Gateway</w:t>
+            </w:r>
+          </w:p>
+        </w:tc>
+        <w:tc>
+          <w:tcPr>
+            <w:tcW w:type="dxa" w:w="1560"/>
+          </w:tcPr>
+          <w:p>
+            <w:pPr>
+              <w:ind w:firstLine="0"/>
+            </w:pPr>
+            <w:r>
+              <w:rPr>
+                <w:sz w:val="18"/>
+              </w:rPr>
+            </w:r>
+            <w:r>
+              <w:rPr>
+                <w:b w:val="0"/>
+                <w:i w:val="0"/>
+                <w:sz w:val="18"/>
+                <w:u w:val="none"/>
+              </w:rPr>
+              <w:t>Operator</w:t>
+            </w:r>
+          </w:p>
+        </w:tc>
+        <w:tc>
+          <w:tcPr>
+            <w:tcW w:type="dxa" w:w="1560"/>
+          </w:tcPr>
+          <w:p>
+            <w:pPr>
+              <w:ind w:firstLine="0"/>
+            </w:pPr>
+            <w:r>
+              <w:rPr>
+                <w:sz w:val="18"/>
+              </w:rPr>
+            </w:r>
+            <w:r>
+              <w:rPr>
+                <w:b w:val="0"/>
+                <w:i w:val="0"/>
+                <w:sz w:val="18"/>
+                <w:u w:val="none"/>
+              </w:rPr>
+              <w:t>0x7bf52655…</w:t>
+            </w:r>
+          </w:p>
+        </w:tc>
+      </w:tr>
+      <w:tr>
+        <w:tc>
+          <w:tcPr>
+            <w:tcW w:type="dxa" w:w="1560"/>
+          </w:tcPr>
+          <w:p>
+            <w:pPr>
+              <w:ind w:firstLine="0"/>
+            </w:pPr>
+            <w:r>
+              <w:rPr>
+                <w:sz w:val="18"/>
+              </w:rPr>
+            </w:r>
+            <w:r>
+              <w:rPr>
+                <w:b w:val="0"/>
+                <w:i w:val="0"/>
+                <w:sz w:val="18"/>
+                <w:u w:val="none"/>
+              </w:rPr>
+              <w:t>8</w:t>
+            </w:r>
+          </w:p>
+        </w:tc>
+        <w:tc>
+          <w:tcPr>
+            <w:tcW w:type="dxa" w:w="1560"/>
+          </w:tcPr>
+          <w:p>
+            <w:pPr>
+              <w:ind w:firstLine="0"/>
+            </w:pPr>
+            <w:r>
+              <w:rPr>
+                <w:sz w:val="18"/>
+              </w:rPr>
+            </w:r>
+            <w:r>
+              <w:rPr>
+                <w:b w:val="0"/>
+                <w:i w:val="0"/>
+                <w:sz w:val="18"/>
+                <w:u w:val="none"/>
+              </w:rPr>
+              <w:t>LABOR</w:t>
+            </w:r>
+          </w:p>
+        </w:tc>
+        <w:tc>
+          <w:tcPr>
+            <w:tcW w:type="dxa" w:w="1560"/>
+          </w:tcPr>
+          <w:p>
+            <w:pPr>
+              <w:ind w:firstLine="0"/>
+            </w:pPr>
+            <w:r>
+              <w:rPr>
+                <w:sz w:val="18"/>
+              </w:rPr>
+            </w:r>
+            <w:r>
+              <w:rPr>
+                <w:b w:val="0"/>
+                <w:i w:val="0"/>
+                <w:sz w:val="18"/>
+                <w:u w:val="none"/>
+              </w:rPr>
+              <w:t>10.0</w:t>
+            </w:r>
+          </w:p>
+        </w:tc>
+        <w:tc>
+          <w:tcPr>
+            <w:tcW w:type="dxa" w:w="1560"/>
+          </w:tcPr>
+          <w:p>
+            <w:pPr>
+              <w:ind w:firstLine="0"/>
+            </w:pPr>
+            <w:r>
+              <w:rPr>
+                <w:sz w:val="18"/>
+              </w:rPr>
+            </w:r>
+            <w:r>
+              <w:rPr>
+                <w:b w:val="0"/>
+                <w:i w:val="0"/>
+                <w:sz w:val="18"/>
+                <w:u w:val="none"/>
+              </w:rPr>
+              <w:t>Maintenance</w:t>
+            </w:r>
+          </w:p>
+        </w:tc>
+        <w:tc>
+          <w:tcPr>
+            <w:tcW w:type="dxa" w:w="1560"/>
+          </w:tcPr>
+          <w:p>
+            <w:pPr>
+              <w:ind w:firstLine="0"/>
+            </w:pPr>
+            <w:r>
+              <w:rPr>
+                <w:sz w:val="18"/>
+              </w:rPr>
+            </w:r>
+            <w:r>
+              <w:rPr>
+                <w:b w:val="0"/>
+                <w:i w:val="0"/>
+                <w:sz w:val="18"/>
+                <w:u w:val="none"/>
+              </w:rPr>
+              <w:t>Operator</w:t>
+            </w:r>
+          </w:p>
+        </w:tc>
+        <w:tc>
+          <w:tcPr>
+            <w:tcW w:type="dxa" w:w="1560"/>
+          </w:tcPr>
+          <w:p>
+            <w:pPr>
+              <w:ind w:firstLine="0"/>
+            </w:pPr>
+            <w:r>
+              <w:rPr>
+                <w:sz w:val="18"/>
+              </w:rPr>
+            </w:r>
+            <w:r>
+              <w:rPr>
+                <w:b w:val="0"/>
+                <w:i w:val="0"/>
+                <w:sz w:val="18"/>
+                <w:u w:val="none"/>
+              </w:rPr>
+              <w:t>0x1f7cd596…</w:t>
+            </w:r>
+          </w:p>
+        </w:tc>
+      </w:tr>
+      <w:tr>
+        <w:tc>
+          <w:tcPr>
+            <w:tcW w:type="dxa" w:w="1560"/>
+          </w:tcPr>
+          <w:p>
+            <w:pPr>
+              <w:ind w:firstLine="0"/>
+            </w:pPr>
+            <w:r>
+              <w:rPr>
+                <w:sz w:val="18"/>
+              </w:rPr>
+            </w:r>
+            <w:r>
+              <w:rPr>
+                <w:b w:val="0"/>
+                <w:i w:val="0"/>
+                <w:sz w:val="18"/>
+                <w:u w:val="none"/>
+              </w:rPr>
+              <w:t>9</w:t>
+            </w:r>
+          </w:p>
+        </w:tc>
+        <w:tc>
+          <w:tcPr>
+            <w:tcW w:type="dxa" w:w="1560"/>
+          </w:tcPr>
+          <w:p>
+            <w:pPr>
+              <w:ind w:firstLine="0"/>
+            </w:pPr>
+            <w:r>
+              <w:rPr>
+                <w:sz w:val="18"/>
+              </w:rPr>
+            </w:r>
+            <w:r>
+              <w:rPr>
+                <w:b w:val="0"/>
+                <w:i w:val="0"/>
+                <w:sz w:val="18"/>
+                <w:u w:val="none"/>
+              </w:rPr>
+              <w:t>GOODS</w:t>
+            </w:r>
+          </w:p>
+        </w:tc>
+        <w:tc>
+          <w:tcPr>
+            <w:tcW w:type="dxa" w:w="1560"/>
+          </w:tcPr>
+          <w:p>
+            <w:pPr>
+              <w:ind w:firstLine="0"/>
+            </w:pPr>
+            <w:r>
+              <w:rPr>
+                <w:sz w:val="18"/>
+              </w:rPr>
+            </w:r>
+            <w:r>
+              <w:rPr>
+                <w:b w:val="0"/>
+                <w:i w:val="0"/>
+                <w:sz w:val="18"/>
+                <w:u w:val="none"/>
+              </w:rPr>
+              <w:t>14.0</w:t>
+            </w:r>
+          </w:p>
+        </w:tc>
+        <w:tc>
+          <w:tcPr>
+            <w:tcW w:type="dxa" w:w="1560"/>
+          </w:tcPr>
+          <w:p>
+            <w:pPr>
+              <w:ind w:firstLine="0"/>
+            </w:pPr>
+            <w:r>
+              <w:rPr>
+                <w:sz w:val="18"/>
+              </w:rPr>
+            </w:r>
+            <w:r>
+              <w:rPr>
+                <w:b w:val="0"/>
+                <w:i w:val="0"/>
+                <w:sz w:val="18"/>
+                <w:u w:val="none"/>
+              </w:rPr>
+              <w:t>Merchant</w:t>
+            </w:r>
+          </w:p>
+        </w:tc>
+        <w:tc>
+          <w:tcPr>
+            <w:tcW w:type="dxa" w:w="1560"/>
+          </w:tcPr>
+          <w:p>
+            <w:pPr>
+              <w:ind w:firstLine="0"/>
+            </w:pPr>
+            <w:r>
+              <w:rPr>
+                <w:sz w:val="18"/>
+              </w:rPr>
+            </w:r>
+            <w:r>
+              <w:rPr>
+                <w:b w:val="0"/>
+                <w:i w:val="0"/>
+                <w:sz w:val="18"/>
+                <w:u w:val="none"/>
+              </w:rPr>
+              <w:t>Operator</w:t>
+            </w:r>
+          </w:p>
+        </w:tc>
+        <w:tc>
+          <w:tcPr>
+            <w:tcW w:type="dxa" w:w="1560"/>
+          </w:tcPr>
+          <w:p>
+            <w:pPr>
+              <w:ind w:firstLine="0"/>
+            </w:pPr>
+            <w:r>
+              <w:rPr>
+                <w:sz w:val="18"/>
+              </w:rPr>
+            </w:r>
+            <w:r>
+              <w:rPr>
+                <w:b w:val="0"/>
+                <w:i w:val="0"/>
+                <w:sz w:val="18"/>
+                <w:u w:val="none"/>
+              </w:rPr>
+              <w:t>0x3b912b39…</w:t>
+            </w:r>
+          </w:p>
+        </w:tc>
+      </w:tr>
+      <w:tr>
+        <w:tc>
+          <w:tcPr>
+            <w:tcW w:type="dxa" w:w="1560"/>
+          </w:tcPr>
+          <w:p>
+            <w:pPr>
+              <w:ind w:firstLine="0"/>
+            </w:pPr>
+            <w:r>
+              <w:rPr>
+                <w:sz w:val="18"/>
+              </w:rPr>
+            </w:r>
+            <w:r>
+              <w:rPr>
+                <w:b w:val="0"/>
+                <w:i w:val="0"/>
+                <w:sz w:val="18"/>
+                <w:u w:val="none"/>
+              </w:rPr>
+              <w:t>10</w:t>
+            </w:r>
+          </w:p>
+        </w:tc>
+        <w:tc>
+          <w:tcPr>
+            <w:tcW w:type="dxa" w:w="1560"/>
+          </w:tcPr>
+          <w:p>
+            <w:pPr>
+              <w:ind w:firstLine="0"/>
+            </w:pPr>
+            <w:r>
+              <w:rPr>
+                <w:sz w:val="18"/>
+              </w:rPr>
+            </w:r>
+            <w:r>
+              <w:rPr>
+                <w:b w:val="0"/>
+                <w:i w:val="0"/>
+                <w:sz w:val="18"/>
+                <w:u w:val="none"/>
+              </w:rPr>
+              <w:t>NETWORK</w:t>
+            </w:r>
+          </w:p>
+        </w:tc>
+        <w:tc>
+          <w:tcPr>
+            <w:tcW w:type="dxa" w:w="1560"/>
+          </w:tcPr>
+          <w:p>
+            <w:pPr>
+              <w:ind w:firstLine="0"/>
+            </w:pPr>
+            <w:r>
+              <w:rPr>
+                <w:sz w:val="18"/>
+              </w:rPr>
+            </w:r>
+            <w:r>
+              <w:rPr>
+                <w:b w:val="0"/>
+                <w:i w:val="0"/>
+                <w:sz w:val="18"/>
+                <w:u w:val="none"/>
+              </w:rPr>
+              <w:t>8.0</w:t>
+            </w:r>
+          </w:p>
+        </w:tc>
+        <w:tc>
+          <w:tcPr>
+            <w:tcW w:type="dxa" w:w="1560"/>
+          </w:tcPr>
+          <w:p>
+            <w:pPr>
+              <w:ind w:firstLine="0"/>
+            </w:pPr>
+            <w:r>
+              <w:rPr>
+                <w:sz w:val="18"/>
+              </w:rPr>
+            </w:r>
+            <w:r>
+              <w:rPr>
+                <w:b w:val="0"/>
+                <w:i w:val="0"/>
+                <w:sz w:val="18"/>
+                <w:u w:val="none"/>
+              </w:rPr>
+              <w:t>Network peer</w:t>
+            </w:r>
+          </w:p>
+        </w:tc>
+        <w:tc>
+          <w:tcPr>
+            <w:tcW w:type="dxa" w:w="1560"/>
+          </w:tcPr>
+          <w:p>
+            <w:pPr>
+              <w:ind w:firstLine="0"/>
+            </w:pPr>
+            <w:r>
+              <w:rPr>
+                <w:sz w:val="18"/>
+              </w:rPr>
+            </w:r>
+            <w:r>
+              <w:rPr>
+                <w:b w:val="0"/>
+                <w:i w:val="0"/>
+                <w:sz w:val="18"/>
+                <w:u w:val="none"/>
+              </w:rPr>
+              <w:t>Operator</w:t>
+            </w:r>
+          </w:p>
+        </w:tc>
+        <w:tc>
+          <w:tcPr>
+            <w:tcW w:type="dxa" w:w="1560"/>
+          </w:tcPr>
+          <w:p>
+            <w:pPr>
+              <w:ind w:firstLine="0"/>
+            </w:pPr>
+            <w:r>
+              <w:rPr>
+                <w:sz w:val="18"/>
+              </w:rPr>
+            </w:r>
+            <w:r>
+              <w:rPr>
+                <w:b w:val="0"/>
+                <w:i w:val="0"/>
+                <w:sz w:val="18"/>
+                <w:u w:val="none"/>
+              </w:rPr>
+              <w:t>0x100b4dec…</w:t>
+            </w:r>
+          </w:p>
+        </w:tc>
+      </w:tr>
+      <w:tr>
+        <w:tc>
+          <w:tcPr>
+            <w:tcW w:type="dxa" w:w="1560"/>
+          </w:tcPr>
+          <w:p>
+            <w:pPr>
+              <w:ind w:firstLine="0"/>
+            </w:pPr>
+            <w:r>
+              <w:rPr>
+                <w:sz w:val="18"/>
+              </w:rPr>
+            </w:r>
+            <w:r>
+              <w:rPr>
+                <w:b w:val="0"/>
+                <w:i w:val="0"/>
+                <w:sz w:val="18"/>
+                <w:u w:val="none"/>
+              </w:rPr>
+              <w:t>11</w:t>
+            </w:r>
+          </w:p>
+        </w:tc>
+        <w:tc>
+          <w:tcPr>
+            <w:tcW w:type="dxa" w:w="1560"/>
+          </w:tcPr>
+          <w:p>
+            <w:pPr>
+              <w:ind w:firstLine="0"/>
+            </w:pPr>
+            <w:r>
+              <w:rPr>
+                <w:sz w:val="18"/>
+              </w:rPr>
+            </w:r>
+            <w:r>
+              <w:rPr>
+                <w:b w:val="0"/>
+                <w:i w:val="0"/>
+                <w:sz w:val="18"/>
+                <w:u w:val="none"/>
+              </w:rPr>
+              <w:t>SERVICE</w:t>
+            </w:r>
+          </w:p>
+        </w:tc>
+        <w:tc>
+          <w:tcPr>
+            <w:tcW w:type="dxa" w:w="1560"/>
+          </w:tcPr>
+          <w:p>
+            <w:pPr>
+              <w:ind w:firstLine="0"/>
+            </w:pPr>
+            <w:r>
+              <w:rPr>
+                <w:sz w:val="18"/>
+              </w:rPr>
+            </w:r>
+            <w:r>
+              <w:rPr>
+                <w:b w:val="0"/>
+                <w:i w:val="0"/>
+                <w:sz w:val="18"/>
+                <w:u w:val="none"/>
+              </w:rPr>
+              <w:t>6.0</w:t>
+            </w:r>
+          </w:p>
+        </w:tc>
+        <w:tc>
+          <w:tcPr>
+            <w:tcW w:type="dxa" w:w="1560"/>
+          </w:tcPr>
+          <w:p>
+            <w:pPr>
+              <w:ind w:firstLine="0"/>
+            </w:pPr>
+            <w:r>
+              <w:rPr>
+                <w:sz w:val="18"/>
+              </w:rPr>
+            </w:r>
+            <w:r>
+              <w:rPr>
+                <w:b w:val="0"/>
+                <w:i w:val="0"/>
+                <w:sz w:val="18"/>
+                <w:u w:val="none"/>
+              </w:rPr>
+              <w:t>Gateway</w:t>
+            </w:r>
+          </w:p>
+        </w:tc>
+        <w:tc>
+          <w:tcPr>
+            <w:tcW w:type="dxa" w:w="1560"/>
+          </w:tcPr>
+          <w:p>
+            <w:pPr>
+              <w:ind w:firstLine="0"/>
+            </w:pPr>
+            <w:r>
+              <w:rPr>
+                <w:sz w:val="18"/>
+              </w:rPr>
+            </w:r>
+            <w:r>
+              <w:rPr>
+                <w:b w:val="0"/>
+                <w:i w:val="0"/>
+                <w:sz w:val="18"/>
+                <w:u w:val="none"/>
+              </w:rPr>
+              <w:t>Operator</w:t>
+            </w:r>
+          </w:p>
+        </w:tc>
+        <w:tc>
+          <w:tcPr>
+            <w:tcW w:type="dxa" w:w="1560"/>
+          </w:tcPr>
+          <w:p>
+            <w:pPr>
+              <w:ind w:firstLine="0"/>
+            </w:pPr>
+            <w:r>
+              <w:rPr>
+                <w:sz w:val="18"/>
+              </w:rPr>
+            </w:r>
+            <w:r>
+              <w:rPr>
+                <w:b w:val="0"/>
+                <w:i w:val="0"/>
+                <w:sz w:val="18"/>
+                <w:u w:val="none"/>
+              </w:rPr>
+              <w:t>0x7d68647a…</w:t>
+            </w:r>
+          </w:p>
+        </w:tc>
+      </w:tr>
+      <w:tr>
+        <w:tc>
+          <w:tcPr>
+            <w:tcW w:type="dxa" w:w="1560"/>
+          </w:tcPr>
+          <w:p>
+            <w:pPr>
+              <w:ind w:firstLine="0"/>
+            </w:pPr>
+            <w:r>
+              <w:rPr>
+                <w:sz w:val="18"/>
+              </w:rPr>
+            </w:r>
+            <w:r>
+              <w:rPr>
+                <w:b w:val="0"/>
+                <w:i w:val="0"/>
+                <w:sz w:val="18"/>
+                <w:u w:val="none"/>
+              </w:rPr>
+              <w:t>12</w:t>
+            </w:r>
+          </w:p>
+        </w:tc>
+        <w:tc>
+          <w:tcPr>
+            <w:tcW w:type="dxa" w:w="1560"/>
+          </w:tcPr>
+          <w:p>
+            <w:pPr>
+              <w:ind w:firstLine="0"/>
+            </w:pPr>
+            <w:r>
+              <w:rPr>
+                <w:sz w:val="18"/>
+              </w:rPr>
+            </w:r>
+            <w:r>
+              <w:rPr>
+                <w:b w:val="0"/>
+                <w:i w:val="0"/>
+                <w:sz w:val="18"/>
+                <w:u w:val="none"/>
+              </w:rPr>
+              <w:t>LABOR</w:t>
+            </w:r>
+          </w:p>
+        </w:tc>
+        <w:tc>
+          <w:tcPr>
+            <w:tcW w:type="dxa" w:w="1560"/>
+          </w:tcPr>
+          <w:p>
+            <w:pPr>
+              <w:ind w:firstLine="0"/>
+            </w:pPr>
+            <w:r>
+              <w:rPr>
+                <w:sz w:val="18"/>
+              </w:rPr>
+            </w:r>
+            <w:r>
+              <w:rPr>
+                <w:b w:val="0"/>
+                <w:i w:val="0"/>
+                <w:sz w:val="18"/>
+                <w:u w:val="none"/>
+              </w:rPr>
+              <w:t>10.0</w:t>
+            </w:r>
+          </w:p>
+        </w:tc>
+        <w:tc>
+          <w:tcPr>
+            <w:tcW w:type="dxa" w:w="1560"/>
+          </w:tcPr>
+          <w:p>
+            <w:pPr>
+              <w:ind w:firstLine="0"/>
+            </w:pPr>
+            <w:r>
+              <w:rPr>
+                <w:sz w:val="18"/>
+              </w:rPr>
+            </w:r>
+            <w:r>
+              <w:rPr>
+                <w:b w:val="0"/>
+                <w:i w:val="0"/>
+                <w:sz w:val="18"/>
+                <w:u w:val="none"/>
+              </w:rPr>
+              <w:t>Maintenance</w:t>
+            </w:r>
+          </w:p>
+        </w:tc>
+        <w:tc>
+          <w:tcPr>
+            <w:tcW w:type="dxa" w:w="1560"/>
+          </w:tcPr>
+          <w:p>
+            <w:pPr>
+              <w:ind w:firstLine="0"/>
+            </w:pPr>
+            <w:r>
+              <w:rPr>
+                <w:sz w:val="18"/>
+              </w:rPr>
+            </w:r>
+            <w:r>
+              <w:rPr>
+                <w:b w:val="0"/>
+                <w:i w:val="0"/>
+                <w:sz w:val="18"/>
+                <w:u w:val="none"/>
+              </w:rPr>
+              <w:t>Operator</w:t>
+            </w:r>
+          </w:p>
+        </w:tc>
+        <w:tc>
+          <w:tcPr>
+            <w:tcW w:type="dxa" w:w="1560"/>
+          </w:tcPr>
+          <w:p>
+            <w:pPr>
+              <w:ind w:firstLine="0"/>
+            </w:pPr>
+            <w:r>
+              <w:rPr>
+                <w:sz w:val="18"/>
+              </w:rPr>
+            </w:r>
+            <w:r>
+              <w:rPr>
+                <w:b w:val="0"/>
+                <w:i w:val="0"/>
+                <w:sz w:val="18"/>
+                <w:u w:val="none"/>
+              </w:rPr>
+              <w:t>0xc1eb24c0…</w:t>
+            </w:r>
+          </w:p>
+        </w:tc>
+      </w:tr>
+      <w:tr>
+        <w:tc>
+          <w:tcPr>
+            <w:tcW w:type="dxa" w:w="1560"/>
+          </w:tcPr>
+          <w:p>
+            <w:pPr>
+              <w:ind w:firstLine="0"/>
+            </w:pPr>
+            <w:r>
+              <w:rPr>
+                <w:sz w:val="18"/>
+              </w:rPr>
+            </w:r>
+            <w:r>
+              <w:rPr>
+                <w:b w:val="0"/>
+                <w:i w:val="0"/>
+                <w:sz w:val="18"/>
+                <w:u w:val="none"/>
+              </w:rPr>
+              <w:t>13</w:t>
+            </w:r>
+          </w:p>
+        </w:tc>
+        <w:tc>
+          <w:tcPr>
+            <w:tcW w:type="dxa" w:w="1560"/>
+          </w:tcPr>
+          <w:p>
+            <w:pPr>
+              <w:ind w:firstLine="0"/>
+            </w:pPr>
+            <w:r>
+              <w:rPr>
+                <w:sz w:val="18"/>
+              </w:rPr>
+            </w:r>
+            <w:r>
+              <w:rPr>
+                <w:b w:val="0"/>
+                <w:i w:val="0"/>
+                <w:sz w:val="18"/>
+                <w:u w:val="none"/>
+              </w:rPr>
+              <w:t>GOODS</w:t>
+            </w:r>
+          </w:p>
+        </w:tc>
+        <w:tc>
+          <w:tcPr>
+            <w:tcW w:type="dxa" w:w="1560"/>
+          </w:tcPr>
+          <w:p>
+            <w:pPr>
+              <w:ind w:firstLine="0"/>
+            </w:pPr>
+            <w:r>
+              <w:rPr>
+                <w:sz w:val="18"/>
+              </w:rPr>
+            </w:r>
+            <w:r>
+              <w:rPr>
+                <w:b w:val="0"/>
+                <w:i w:val="0"/>
+                <w:sz w:val="18"/>
+                <w:u w:val="none"/>
+              </w:rPr>
+              <w:t>14.0</w:t>
+            </w:r>
+          </w:p>
+        </w:tc>
+        <w:tc>
+          <w:tcPr>
+            <w:tcW w:type="dxa" w:w="1560"/>
+          </w:tcPr>
+          <w:p>
+            <w:pPr>
+              <w:ind w:firstLine="0"/>
+            </w:pPr>
+            <w:r>
+              <w:rPr>
+                <w:sz w:val="18"/>
+              </w:rPr>
+            </w:r>
+            <w:r>
+              <w:rPr>
+                <w:b w:val="0"/>
+                <w:i w:val="0"/>
+                <w:sz w:val="18"/>
+                <w:u w:val="none"/>
+              </w:rPr>
+              <w:t>Merchant</w:t>
+            </w:r>
+          </w:p>
+        </w:tc>
+        <w:tc>
+          <w:tcPr>
+            <w:tcW w:type="dxa" w:w="1560"/>
+          </w:tcPr>
+          <w:p>
+            <w:pPr>
+              <w:ind w:firstLine="0"/>
+            </w:pPr>
+            <w:r>
+              <w:rPr>
+                <w:sz w:val="18"/>
+              </w:rPr>
+            </w:r>
+            <w:r>
+              <w:rPr>
+                <w:b w:val="0"/>
+                <w:i w:val="0"/>
+                <w:sz w:val="18"/>
+                <w:u w:val="none"/>
+              </w:rPr>
+              <w:t>Operator</w:t>
+            </w:r>
+          </w:p>
+        </w:tc>
+        <w:tc>
+          <w:tcPr>
+            <w:tcW w:type="dxa" w:w="1560"/>
+          </w:tcPr>
+          <w:p>
+            <w:pPr>
+              <w:ind w:firstLine="0"/>
+            </w:pPr>
+            <w:r>
+              <w:rPr>
+                <w:sz w:val="18"/>
+              </w:rPr>
+            </w:r>
+            <w:r>
+              <w:rPr>
+                <w:b w:val="0"/>
+                <w:i w:val="0"/>
+                <w:sz w:val="18"/>
+                <w:u w:val="none"/>
+              </w:rPr>
+              <w:t>0xd01d4ab8…</w:t>
+            </w:r>
+          </w:p>
+        </w:tc>
+      </w:tr>
+      <w:tr>
+        <w:tc>
+          <w:tcPr>
+            <w:tcW w:type="dxa" w:w="1560"/>
+          </w:tcPr>
+          <w:p>
+            <w:pPr>
+              <w:ind w:firstLine="0"/>
+            </w:pPr>
+            <w:r>
+              <w:rPr>
+                <w:sz w:val="18"/>
+              </w:rPr>
+            </w:r>
+            <w:r>
+              <w:rPr>
+                <w:b w:val="0"/>
+                <w:i w:val="0"/>
+                <w:sz w:val="18"/>
+                <w:u w:val="none"/>
+              </w:rPr>
+              <w:t>14</w:t>
+            </w:r>
+          </w:p>
+        </w:tc>
+        <w:tc>
+          <w:tcPr>
+            <w:tcW w:type="dxa" w:w="1560"/>
+          </w:tcPr>
+          <w:p>
+            <w:pPr>
+              <w:ind w:firstLine="0"/>
+            </w:pPr>
+            <w:r>
+              <w:rPr>
+                <w:sz w:val="18"/>
+              </w:rPr>
+            </w:r>
+            <w:r>
+              <w:rPr>
+                <w:b w:val="0"/>
+                <w:i w:val="0"/>
+                <w:sz w:val="18"/>
+                <w:u w:val="none"/>
+              </w:rPr>
+              <w:t>NETWORK</w:t>
+            </w:r>
+          </w:p>
+        </w:tc>
+        <w:tc>
+          <w:tcPr>
+            <w:tcW w:type="dxa" w:w="1560"/>
+          </w:tcPr>
+          <w:p>
+            <w:pPr>
+              <w:ind w:firstLine="0"/>
+            </w:pPr>
+            <w:r>
+              <w:rPr>
+                <w:sz w:val="18"/>
+              </w:rPr>
+            </w:r>
+            <w:r>
+              <w:rPr>
+                <w:b w:val="0"/>
+                <w:i w:val="0"/>
+                <w:sz w:val="18"/>
+                <w:u w:val="none"/>
+              </w:rPr>
+              <w:t>8.0</w:t>
+            </w:r>
+          </w:p>
+        </w:tc>
+        <w:tc>
+          <w:tcPr>
+            <w:tcW w:type="dxa" w:w="1560"/>
+          </w:tcPr>
+          <w:p>
+            <w:pPr>
+              <w:ind w:firstLine="0"/>
+            </w:pPr>
+            <w:r>
+              <w:rPr>
+                <w:sz w:val="18"/>
+              </w:rPr>
+            </w:r>
+            <w:r>
+              <w:rPr>
+                <w:b w:val="0"/>
+                <w:i w:val="0"/>
+                <w:sz w:val="18"/>
+                <w:u w:val="none"/>
+              </w:rPr>
+              <w:t>Network peer</w:t>
+            </w:r>
+          </w:p>
+        </w:tc>
+        <w:tc>
+          <w:tcPr>
+            <w:tcW w:type="dxa" w:w="1560"/>
+          </w:tcPr>
+          <w:p>
+            <w:pPr>
+              <w:ind w:firstLine="0"/>
+            </w:pPr>
+            <w:r>
+              <w:rPr>
+                <w:sz w:val="18"/>
+              </w:rPr>
+            </w:r>
+            <w:r>
+              <w:rPr>
+                <w:b w:val="0"/>
+                <w:i w:val="0"/>
+                <w:sz w:val="18"/>
+                <w:u w:val="none"/>
+              </w:rPr>
+              <w:t>Operator</w:t>
+            </w:r>
+          </w:p>
+        </w:tc>
+        <w:tc>
+          <w:tcPr>
+            <w:tcW w:type="dxa" w:w="1560"/>
+          </w:tcPr>
+          <w:p>
+            <w:pPr>
+              <w:ind w:firstLine="0"/>
+            </w:pPr>
+            <w:r>
+              <w:rPr>
+                <w:sz w:val="18"/>
+              </w:rPr>
+            </w:r>
+            <w:r>
+              <w:rPr>
+                <w:b w:val="0"/>
+                <w:i w:val="0"/>
+                <w:sz w:val="18"/>
+                <w:u w:val="none"/>
+              </w:rPr>
+              <w:t>0x2b8e8efb…</w:t>
+            </w:r>
+          </w:p>
+        </w:tc>
+      </w:tr>
+      <w:tr>
+        <w:tc>
+          <w:tcPr>
+            <w:tcW w:type="dxa" w:w="1560"/>
+          </w:tcPr>
+          <w:p>
+            <w:pPr>
+              <w:ind w:firstLine="0"/>
+            </w:pPr>
+            <w:r>
+              <w:rPr>
+                <w:sz w:val="18"/>
+              </w:rPr>
+            </w:r>
+            <w:r>
+              <w:rPr>
+                <w:b w:val="0"/>
+                <w:i w:val="0"/>
+                <w:sz w:val="18"/>
+                <w:u w:val="none"/>
+              </w:rPr>
+              <w:t>15</w:t>
+            </w:r>
+          </w:p>
+        </w:tc>
+        <w:tc>
+          <w:tcPr>
+            <w:tcW w:type="dxa" w:w="1560"/>
+          </w:tcPr>
+          <w:p>
+            <w:pPr>
+              <w:ind w:firstLine="0"/>
+            </w:pPr>
+            <w:r>
+              <w:rPr>
+                <w:sz w:val="18"/>
+              </w:rPr>
+            </w:r>
+            <w:r>
+              <w:rPr>
+                <w:b w:val="0"/>
+                <w:i w:val="0"/>
+                <w:sz w:val="18"/>
+                <w:u w:val="none"/>
+              </w:rPr>
+              <w:t>GOODS</w:t>
+            </w:r>
+          </w:p>
+        </w:tc>
+        <w:tc>
+          <w:tcPr>
+            <w:tcW w:type="dxa" w:w="1560"/>
+          </w:tcPr>
+          <w:p>
+            <w:pPr>
+              <w:ind w:firstLine="0"/>
+            </w:pPr>
+            <w:r>
+              <w:rPr>
+                <w:sz w:val="18"/>
+              </w:rPr>
+            </w:r>
+            <w:r>
+              <w:rPr>
+                <w:b w:val="0"/>
+                <w:i w:val="0"/>
+                <w:sz w:val="18"/>
+                <w:u w:val="none"/>
+              </w:rPr>
+              <w:t>5.0</w:t>
+            </w:r>
+          </w:p>
+        </w:tc>
+        <w:tc>
+          <w:tcPr>
+            <w:tcW w:type="dxa" w:w="1560"/>
+          </w:tcPr>
+          <w:p>
+            <w:pPr>
+              <w:ind w:firstLine="0"/>
+            </w:pPr>
+            <w:r>
+              <w:rPr>
+                <w:sz w:val="18"/>
+              </w:rPr>
+            </w:r>
+            <w:r>
+              <w:rPr>
+                <w:b w:val="0"/>
+                <w:i w:val="0"/>
+                <w:sz w:val="18"/>
+                <w:u w:val="none"/>
+              </w:rPr>
+              <w:t>Merchant</w:t>
+            </w:r>
+          </w:p>
+        </w:tc>
+        <w:tc>
+          <w:tcPr>
+            <w:tcW w:type="dxa" w:w="1560"/>
+          </w:tcPr>
+          <w:p>
+            <w:pPr>
+              <w:ind w:firstLine="0"/>
+            </w:pPr>
+            <w:r>
+              <w:rPr>
+                <w:sz w:val="18"/>
+              </w:rPr>
+            </w:r>
+            <w:r>
+              <w:rPr>
+                <w:b w:val="0"/>
+                <w:i w:val="0"/>
+                <w:sz w:val="18"/>
+                <w:u w:val="none"/>
+              </w:rPr>
+              <w:t>Pilot payer</w:t>
+            </w:r>
+          </w:p>
+        </w:tc>
+        <w:tc>
+          <w:tcPr>
+            <w:tcW w:type="dxa" w:w="1560"/>
+          </w:tcPr>
+          <w:p>
+            <w:pPr>
+              <w:ind w:firstLine="0"/>
+            </w:pPr>
+            <w:r>
+              <w:rPr>
+                <w:sz w:val="18"/>
+              </w:rPr>
+            </w:r>
+            <w:r>
+              <w:rPr>
+                <w:b w:val="0"/>
+                <w:i w:val="0"/>
+                <w:sz w:val="18"/>
+                <w:u w:val="none"/>
+              </w:rPr>
+              <w:t>0xbd7bb0e5…</w:t>
+            </w:r>
+          </w:p>
+        </w:tc>
+      </w:tr>
+      <w:tr>
+        <w:tc>
+          <w:tcPr>
+            <w:tcW w:type="dxa" w:w="1560"/>
+          </w:tcPr>
+          <w:p>
+            <w:pPr>
+              <w:ind w:firstLine="0"/>
+            </w:pPr>
+            <w:r>
+              <w:rPr>
+                <w:sz w:val="18"/>
+              </w:rPr>
+            </w:r>
+            <w:r>
+              <w:rPr>
+                <w:b w:val="0"/>
+                <w:i w:val="0"/>
+                <w:sz w:val="18"/>
+                <w:u w:val="none"/>
+              </w:rPr>
+              <w:t>16</w:t>
+            </w:r>
+          </w:p>
+        </w:tc>
+        <w:tc>
+          <w:tcPr>
+            <w:tcW w:type="dxa" w:w="1560"/>
+          </w:tcPr>
+          <w:p>
+            <w:pPr>
+              <w:ind w:firstLine="0"/>
+            </w:pPr>
+            <w:r>
+              <w:rPr>
+                <w:sz w:val="18"/>
+              </w:rPr>
+            </w:r>
+            <w:r>
+              <w:rPr>
+                <w:b w:val="0"/>
+                <w:i w:val="0"/>
+                <w:sz w:val="18"/>
+                <w:u w:val="none"/>
+              </w:rPr>
+              <w:t>SERVICE</w:t>
+            </w:r>
+          </w:p>
+        </w:tc>
+        <w:tc>
+          <w:tcPr>
+            <w:tcW w:type="dxa" w:w="1560"/>
+          </w:tcPr>
+          <w:p>
+            <w:pPr>
+              <w:ind w:firstLine="0"/>
+            </w:pPr>
+            <w:r>
+              <w:rPr>
+                <w:sz w:val="18"/>
+              </w:rPr>
+            </w:r>
+            <w:r>
+              <w:rPr>
+                <w:b w:val="0"/>
+                <w:i w:val="0"/>
+                <w:sz w:val="18"/>
+                <w:u w:val="none"/>
+              </w:rPr>
+              <w:t>6.0</w:t>
+            </w:r>
+          </w:p>
+        </w:tc>
+        <w:tc>
+          <w:tcPr>
+            <w:tcW w:type="dxa" w:w="1560"/>
+          </w:tcPr>
+          <w:p>
+            <w:pPr>
+              <w:ind w:firstLine="0"/>
+            </w:pPr>
+            <w:r>
+              <w:rPr>
+                <w:sz w:val="18"/>
+              </w:rPr>
+            </w:r>
+            <w:r>
+              <w:rPr>
+                <w:b w:val="0"/>
+                <w:i w:val="0"/>
+                <w:sz w:val="18"/>
+                <w:u w:val="none"/>
+              </w:rPr>
+              <w:t>Gateway</w:t>
+            </w:r>
+          </w:p>
+        </w:tc>
+        <w:tc>
+          <w:tcPr>
+            <w:tcW w:type="dxa" w:w="1560"/>
+          </w:tcPr>
+          <w:p>
+            <w:pPr>
+              <w:ind w:firstLine="0"/>
+            </w:pPr>
+            <w:r>
+              <w:rPr>
+                <w:sz w:val="18"/>
+              </w:rPr>
+            </w:r>
+            <w:r>
+              <w:rPr>
+                <w:b w:val="0"/>
+                <w:i w:val="0"/>
+                <w:sz w:val="18"/>
+                <w:u w:val="none"/>
+              </w:rPr>
+              <w:t>Operator</w:t>
+            </w:r>
+          </w:p>
+        </w:tc>
+        <w:tc>
+          <w:tcPr>
+            <w:tcW w:type="dxa" w:w="1560"/>
+          </w:tcPr>
+          <w:p>
+            <w:pPr>
+              <w:ind w:firstLine="0"/>
+            </w:pPr>
+            <w:r>
+              <w:rPr>
+                <w:sz w:val="18"/>
+              </w:rPr>
+            </w:r>
+            <w:r>
+              <w:rPr>
+                <w:b w:val="0"/>
+                <w:i w:val="0"/>
+                <w:sz w:val="18"/>
+                <w:u w:val="none"/>
+              </w:rPr>
+              <w:t>0x7bd6389e…</w:t>
+            </w:r>
+          </w:p>
+        </w:tc>
+      </w:tr>
+      <w:tr>
+        <w:tc>
+          <w:tcPr>
+            <w:tcW w:type="dxa" w:w="1560"/>
+          </w:tcPr>
+          <w:p>
+            <w:pPr>
+              <w:ind w:firstLine="0"/>
+            </w:pPr>
+            <w:r>
+              <w:rPr>
+                <w:sz w:val="18"/>
+              </w:rPr>
+            </w:r>
+            <w:r>
+              <w:rPr>
+                <w:b w:val="0"/>
+                <w:i w:val="0"/>
+                <w:sz w:val="18"/>
+                <w:u w:val="none"/>
+              </w:rPr>
+              <w:t>17</w:t>
+            </w:r>
+          </w:p>
+        </w:tc>
+        <w:tc>
+          <w:tcPr>
+            <w:tcW w:type="dxa" w:w="1560"/>
+          </w:tcPr>
+          <w:p>
+            <w:pPr>
+              <w:ind w:firstLine="0"/>
+            </w:pPr>
+            <w:r>
+              <w:rPr>
+                <w:sz w:val="18"/>
+              </w:rPr>
+            </w:r>
+            <w:r>
+              <w:rPr>
+                <w:b w:val="0"/>
+                <w:i w:val="0"/>
+                <w:sz w:val="18"/>
+                <w:u w:val="none"/>
+              </w:rPr>
+              <w:t>LABOR</w:t>
+            </w:r>
+          </w:p>
+        </w:tc>
+        <w:tc>
+          <w:tcPr>
+            <w:tcW w:type="dxa" w:w="1560"/>
+          </w:tcPr>
+          <w:p>
+            <w:pPr>
+              <w:ind w:firstLine="0"/>
+            </w:pPr>
+            <w:r>
+              <w:rPr>
+                <w:sz w:val="18"/>
+              </w:rPr>
+            </w:r>
+            <w:r>
+              <w:rPr>
+                <w:b w:val="0"/>
+                <w:i w:val="0"/>
+                <w:sz w:val="18"/>
+                <w:u w:val="none"/>
+              </w:rPr>
+              <w:t>10.0</w:t>
+            </w:r>
+          </w:p>
+        </w:tc>
+        <w:tc>
+          <w:tcPr>
+            <w:tcW w:type="dxa" w:w="1560"/>
+          </w:tcPr>
+          <w:p>
+            <w:pPr>
+              <w:ind w:firstLine="0"/>
+            </w:pPr>
+            <w:r>
+              <w:rPr>
+                <w:sz w:val="18"/>
+              </w:rPr>
+            </w:r>
+            <w:r>
+              <w:rPr>
+                <w:b w:val="0"/>
+                <w:i w:val="0"/>
+                <w:sz w:val="18"/>
+                <w:u w:val="none"/>
+              </w:rPr>
+              <w:t>Maintenance</w:t>
+            </w:r>
+          </w:p>
+        </w:tc>
+        <w:tc>
+          <w:tcPr>
+            <w:tcW w:type="dxa" w:w="1560"/>
+          </w:tcPr>
+          <w:p>
+            <w:pPr>
+              <w:ind w:firstLine="0"/>
+            </w:pPr>
+            <w:r>
+              <w:rPr>
+                <w:sz w:val="18"/>
+              </w:rPr>
+            </w:r>
+            <w:r>
+              <w:rPr>
+                <w:b w:val="0"/>
+                <w:i w:val="0"/>
+                <w:sz w:val="18"/>
+                <w:u w:val="none"/>
+              </w:rPr>
+              <w:t>Operator</w:t>
+            </w:r>
+          </w:p>
+        </w:tc>
+        <w:tc>
+          <w:tcPr>
+            <w:tcW w:type="dxa" w:w="1560"/>
+          </w:tcPr>
+          <w:p>
+            <w:pPr>
+              <w:ind w:firstLine="0"/>
+            </w:pPr>
+            <w:r>
+              <w:rPr>
+                <w:sz w:val="18"/>
+              </w:rPr>
+            </w:r>
+            <w:r>
+              <w:rPr>
+                <w:b w:val="0"/>
+                <w:i w:val="0"/>
+                <w:sz w:val="18"/>
+                <w:u w:val="none"/>
+              </w:rPr>
+              <w:t>0x2fd62cdc…</w:t>
+            </w:r>
+          </w:p>
+        </w:tc>
+      </w:tr>
+      <w:tr>
+        <w:tc>
+          <w:tcPr>
+            <w:tcW w:type="dxa" w:w="1560"/>
+          </w:tcPr>
+          <w:p>
+            <w:pPr>
+              <w:ind w:firstLine="0"/>
+            </w:pPr>
+            <w:r>
+              <w:rPr>
+                <w:sz w:val="18"/>
+              </w:rPr>
+            </w:r>
+            <w:r>
+              <w:rPr>
+                <w:b w:val="0"/>
+                <w:i w:val="0"/>
+                <w:sz w:val="18"/>
+                <w:u w:val="none"/>
+              </w:rPr>
+              <w:t>18</w:t>
+            </w:r>
+          </w:p>
+        </w:tc>
+        <w:tc>
+          <w:tcPr>
+            <w:tcW w:type="dxa" w:w="1560"/>
+          </w:tcPr>
+          <w:p>
+            <w:pPr>
+              <w:ind w:firstLine="0"/>
+            </w:pPr>
+            <w:r>
+              <w:rPr>
+                <w:sz w:val="18"/>
+              </w:rPr>
+            </w:r>
+            <w:r>
+              <w:rPr>
+                <w:b w:val="0"/>
+                <w:i w:val="0"/>
+                <w:sz w:val="18"/>
+                <w:u w:val="none"/>
+              </w:rPr>
+              <w:t>SERVICE</w:t>
+            </w:r>
+          </w:p>
+        </w:tc>
+        <w:tc>
+          <w:tcPr>
+            <w:tcW w:type="dxa" w:w="1560"/>
+          </w:tcPr>
+          <w:p>
+            <w:pPr>
+              <w:ind w:firstLine="0"/>
+            </w:pPr>
+            <w:r>
+              <w:rPr>
+                <w:sz w:val="18"/>
+              </w:rPr>
+            </w:r>
+            <w:r>
+              <w:rPr>
+                <w:b w:val="0"/>
+                <w:i w:val="0"/>
+                <w:sz w:val="18"/>
+                <w:u w:val="none"/>
+              </w:rPr>
+              <w:t>6.0</w:t>
+            </w:r>
+          </w:p>
+        </w:tc>
+        <w:tc>
+          <w:tcPr>
+            <w:tcW w:type="dxa" w:w="1560"/>
+          </w:tcPr>
+          <w:p>
+            <w:pPr>
+              <w:ind w:firstLine="0"/>
+            </w:pPr>
+            <w:r>
+              <w:rPr>
+                <w:sz w:val="18"/>
+              </w:rPr>
+            </w:r>
+            <w:r>
+              <w:rPr>
+                <w:b w:val="0"/>
+                <w:i w:val="0"/>
+                <w:sz w:val="18"/>
+                <w:u w:val="none"/>
+              </w:rPr>
+              <w:t>Gateway</w:t>
+            </w:r>
+          </w:p>
+        </w:tc>
+        <w:tc>
+          <w:tcPr>
+            <w:tcW w:type="dxa" w:w="1560"/>
+          </w:tcPr>
+          <w:p>
+            <w:pPr>
+              <w:ind w:firstLine="0"/>
+            </w:pPr>
+            <w:r>
+              <w:rPr>
+                <w:sz w:val="18"/>
+              </w:rPr>
+            </w:r>
+            <w:r>
+              <w:rPr>
+                <w:b w:val="0"/>
+                <w:i w:val="0"/>
+                <w:sz w:val="18"/>
+                <w:u w:val="none"/>
+              </w:rPr>
+              <w:t>Operator</w:t>
+            </w:r>
+          </w:p>
+        </w:tc>
+        <w:tc>
+          <w:tcPr>
+            <w:tcW w:type="dxa" w:w="1560"/>
+          </w:tcPr>
+          <w:p>
+            <w:pPr>
+              <w:ind w:firstLine="0"/>
+            </w:pPr>
+            <w:r>
+              <w:rPr>
+                <w:sz w:val="18"/>
+              </w:rPr>
+            </w:r>
+            <w:r>
+              <w:rPr>
+                <w:b w:val="0"/>
+                <w:i w:val="0"/>
+                <w:sz w:val="18"/>
+                <w:u w:val="none"/>
+              </w:rPr>
+              <w:t>0xfc63cd22…</w:t>
+            </w:r>
+          </w:p>
+        </w:tc>
+      </w:tr>
+      <w:tr>
+        <w:tc>
+          <w:tcPr>
+            <w:tcW w:type="dxa" w:w="1560"/>
+          </w:tcPr>
+          <w:p>
+            <w:pPr>
+              <w:ind w:firstLine="0"/>
+            </w:pPr>
+            <w:r>
+              <w:rPr>
+                <w:sz w:val="18"/>
+              </w:rPr>
+            </w:r>
+            <w:r>
+              <w:rPr>
+                <w:b w:val="0"/>
+                <w:i w:val="0"/>
+                <w:sz w:val="18"/>
+                <w:u w:val="none"/>
+              </w:rPr>
+              <w:t>19</w:t>
+            </w:r>
+          </w:p>
+        </w:tc>
+        <w:tc>
+          <w:tcPr>
+            <w:tcW w:type="dxa" w:w="1560"/>
+          </w:tcPr>
+          <w:p>
+            <w:pPr>
+              <w:ind w:firstLine="0"/>
+            </w:pPr>
+            <w:r>
+              <w:rPr>
+                <w:sz w:val="18"/>
+              </w:rPr>
+            </w:r>
+            <w:r>
+              <w:rPr>
+                <w:b w:val="0"/>
+                <w:i w:val="0"/>
+                <w:sz w:val="18"/>
+                <w:u w:val="none"/>
+              </w:rPr>
+              <w:t>LABOR</w:t>
+            </w:r>
+          </w:p>
+        </w:tc>
+        <w:tc>
+          <w:tcPr>
+            <w:tcW w:type="dxa" w:w="1560"/>
+          </w:tcPr>
+          <w:p>
+            <w:pPr>
+              <w:ind w:firstLine="0"/>
+            </w:pPr>
+            <w:r>
+              <w:rPr>
+                <w:sz w:val="18"/>
+              </w:rPr>
+            </w:r>
+            <w:r>
+              <w:rPr>
+                <w:b w:val="0"/>
+                <w:i w:val="0"/>
+                <w:sz w:val="18"/>
+                <w:u w:val="none"/>
+              </w:rPr>
+              <w:t>10.0</w:t>
+            </w:r>
+          </w:p>
+        </w:tc>
+        <w:tc>
+          <w:tcPr>
+            <w:tcW w:type="dxa" w:w="1560"/>
+          </w:tcPr>
+          <w:p>
+            <w:pPr>
+              <w:ind w:firstLine="0"/>
+            </w:pPr>
+            <w:r>
+              <w:rPr>
+                <w:sz w:val="18"/>
+              </w:rPr>
+            </w:r>
+            <w:r>
+              <w:rPr>
+                <w:b w:val="0"/>
+                <w:i w:val="0"/>
+                <w:sz w:val="18"/>
+                <w:u w:val="none"/>
+              </w:rPr>
+              <w:t>Maintenance</w:t>
+            </w:r>
+          </w:p>
+        </w:tc>
+        <w:tc>
+          <w:tcPr>
+            <w:tcW w:type="dxa" w:w="1560"/>
+          </w:tcPr>
+          <w:p>
+            <w:pPr>
+              <w:ind w:firstLine="0"/>
+            </w:pPr>
+            <w:r>
+              <w:rPr>
+                <w:sz w:val="18"/>
+              </w:rPr>
+            </w:r>
+            <w:r>
+              <w:rPr>
+                <w:b w:val="0"/>
+                <w:i w:val="0"/>
+                <w:sz w:val="18"/>
+                <w:u w:val="none"/>
+              </w:rPr>
+              <w:t>Operator</w:t>
+            </w:r>
+          </w:p>
+        </w:tc>
+        <w:tc>
+          <w:tcPr>
+            <w:tcW w:type="dxa" w:w="1560"/>
+          </w:tcPr>
+          <w:p>
+            <w:pPr>
+              <w:ind w:firstLine="0"/>
+            </w:pPr>
+            <w:r>
+              <w:rPr>
+                <w:sz w:val="18"/>
+              </w:rPr>
+            </w:r>
+            <w:r>
+              <w:rPr>
+                <w:b w:val="0"/>
+                <w:i w:val="0"/>
+                <w:sz w:val="18"/>
+                <w:u w:val="none"/>
+              </w:rPr>
+              <w:t>0xb620ea8c…</w:t>
+            </w:r>
+          </w:p>
+        </w:tc>
+      </w:tr>
+      <w:tr>
+        <w:tc>
+          <w:tcPr>
+            <w:tcW w:type="dxa" w:w="1560"/>
+          </w:tcPr>
+          <w:p>
+            <w:pPr>
+              <w:ind w:firstLine="0"/>
+            </w:pPr>
+            <w:r>
+              <w:rPr>
+                <w:sz w:val="18"/>
+              </w:rPr>
+            </w:r>
+            <w:r>
+              <w:rPr>
+                <w:b w:val="0"/>
+                <w:i w:val="0"/>
+                <w:sz w:val="18"/>
+                <w:u w:val="none"/>
+              </w:rPr>
+              <w:t>20</w:t>
+            </w:r>
+          </w:p>
+        </w:tc>
+        <w:tc>
+          <w:tcPr>
+            <w:tcW w:type="dxa" w:w="1560"/>
+          </w:tcPr>
+          <w:p>
+            <w:pPr>
+              <w:ind w:firstLine="0"/>
+            </w:pPr>
+            <w:r>
+              <w:rPr>
+                <w:sz w:val="18"/>
+              </w:rPr>
+            </w:r>
+            <w:r>
+              <w:rPr>
+                <w:b w:val="0"/>
+                <w:i w:val="0"/>
+                <w:sz w:val="18"/>
+                <w:u w:val="none"/>
+              </w:rPr>
+              <w:t>GOODS</w:t>
+            </w:r>
+          </w:p>
+        </w:tc>
+        <w:tc>
+          <w:tcPr>
+            <w:tcW w:type="dxa" w:w="1560"/>
+          </w:tcPr>
+          <w:p>
+            <w:pPr>
+              <w:ind w:firstLine="0"/>
+            </w:pPr>
+            <w:r>
+              <w:rPr>
+                <w:sz w:val="18"/>
+              </w:rPr>
+            </w:r>
+            <w:r>
+              <w:rPr>
+                <w:b w:val="0"/>
+                <w:i w:val="0"/>
+                <w:sz w:val="18"/>
+                <w:u w:val="none"/>
+              </w:rPr>
+              <w:t>14.0</w:t>
+            </w:r>
+          </w:p>
+        </w:tc>
+        <w:tc>
+          <w:tcPr>
+            <w:tcW w:type="dxa" w:w="1560"/>
+          </w:tcPr>
+          <w:p>
+            <w:pPr>
+              <w:ind w:firstLine="0"/>
+            </w:pPr>
+            <w:r>
+              <w:rPr>
+                <w:sz w:val="18"/>
+              </w:rPr>
+            </w:r>
+            <w:r>
+              <w:rPr>
+                <w:b w:val="0"/>
+                <w:i w:val="0"/>
+                <w:sz w:val="18"/>
+                <w:u w:val="none"/>
+              </w:rPr>
+              <w:t>Merchant</w:t>
+            </w:r>
+          </w:p>
+        </w:tc>
+        <w:tc>
+          <w:tcPr>
+            <w:tcW w:type="dxa" w:w="1560"/>
+          </w:tcPr>
+          <w:p>
+            <w:pPr>
+              <w:ind w:firstLine="0"/>
+            </w:pPr>
+            <w:r>
+              <w:rPr>
+                <w:sz w:val="18"/>
+              </w:rPr>
+            </w:r>
+            <w:r>
+              <w:rPr>
+                <w:b w:val="0"/>
+                <w:i w:val="0"/>
+                <w:sz w:val="18"/>
+                <w:u w:val="none"/>
+              </w:rPr>
+              <w:t>Operator</w:t>
+            </w:r>
+          </w:p>
+        </w:tc>
+        <w:tc>
+          <w:tcPr>
+            <w:tcW w:type="dxa" w:w="1560"/>
+          </w:tcPr>
+          <w:p>
+            <w:pPr>
+              <w:ind w:firstLine="0"/>
+            </w:pPr>
+            <w:r>
+              <w:rPr>
+                <w:sz w:val="18"/>
+              </w:rPr>
+            </w:r>
+            <w:r>
+              <w:rPr>
+                <w:b w:val="0"/>
+                <w:i w:val="0"/>
+                <w:sz w:val="18"/>
+                <w:u w:val="none"/>
+              </w:rPr>
+              <w:t>0x6b1f3801…</w:t>
+            </w:r>
+          </w:p>
+        </w:tc>
+      </w:tr>
+      <w:tr>
+        <w:tc>
+          <w:tcPr>
+            <w:tcW w:type="dxa" w:w="1560"/>
+          </w:tcPr>
+          <w:p>
+            <w:pPr>
+              <w:ind w:firstLine="0"/>
+            </w:pPr>
+            <w:r>
+              <w:rPr>
+                <w:sz w:val="18"/>
+              </w:rPr>
+            </w:r>
+            <w:r>
+              <w:rPr>
+                <w:b w:val="0"/>
+                <w:i w:val="0"/>
+                <w:sz w:val="18"/>
+                <w:u w:val="none"/>
+              </w:rPr>
+              <w:t>21</w:t>
+            </w:r>
+          </w:p>
+        </w:tc>
+        <w:tc>
+          <w:tcPr>
+            <w:tcW w:type="dxa" w:w="1560"/>
+          </w:tcPr>
+          <w:p>
+            <w:pPr>
+              <w:ind w:firstLine="0"/>
+            </w:pPr>
+            <w:r>
+              <w:rPr>
+                <w:sz w:val="18"/>
+              </w:rPr>
+            </w:r>
+            <w:r>
+              <w:rPr>
+                <w:b w:val="0"/>
+                <w:i w:val="0"/>
+                <w:sz w:val="18"/>
+                <w:u w:val="none"/>
+              </w:rPr>
+              <w:t>NETWORK</w:t>
+            </w:r>
+          </w:p>
+        </w:tc>
+        <w:tc>
+          <w:tcPr>
+            <w:tcW w:type="dxa" w:w="1560"/>
+          </w:tcPr>
+          <w:p>
+            <w:pPr>
+              <w:ind w:firstLine="0"/>
+            </w:pPr>
+            <w:r>
+              <w:rPr>
+                <w:sz w:val="18"/>
+              </w:rPr>
+            </w:r>
+            <w:r>
+              <w:rPr>
+                <w:b w:val="0"/>
+                <w:i w:val="0"/>
+                <w:sz w:val="18"/>
+                <w:u w:val="none"/>
+              </w:rPr>
+              <w:t>8.0</w:t>
+            </w:r>
+          </w:p>
+        </w:tc>
+        <w:tc>
+          <w:tcPr>
+            <w:tcW w:type="dxa" w:w="1560"/>
+          </w:tcPr>
+          <w:p>
+            <w:pPr>
+              <w:ind w:firstLine="0"/>
+            </w:pPr>
+            <w:r>
+              <w:rPr>
+                <w:sz w:val="18"/>
+              </w:rPr>
+            </w:r>
+            <w:r>
+              <w:rPr>
+                <w:b w:val="0"/>
+                <w:i w:val="0"/>
+                <w:sz w:val="18"/>
+                <w:u w:val="none"/>
+              </w:rPr>
+              <w:t>Network peer</w:t>
+            </w:r>
+          </w:p>
+        </w:tc>
+        <w:tc>
+          <w:tcPr>
+            <w:tcW w:type="dxa" w:w="1560"/>
+          </w:tcPr>
+          <w:p>
+            <w:pPr>
+              <w:ind w:firstLine="0"/>
+            </w:pPr>
+            <w:r>
+              <w:rPr>
+                <w:sz w:val="18"/>
+              </w:rPr>
+            </w:r>
+            <w:r>
+              <w:rPr>
+                <w:b w:val="0"/>
+                <w:i w:val="0"/>
+                <w:sz w:val="18"/>
+                <w:u w:val="none"/>
+              </w:rPr>
+              <w:t>Operator</w:t>
+            </w:r>
+          </w:p>
+        </w:tc>
+        <w:tc>
+          <w:tcPr>
+            <w:tcW w:type="dxa" w:w="1560"/>
+          </w:tcPr>
+          <w:p>
+            <w:pPr>
+              <w:ind w:firstLine="0"/>
+            </w:pPr>
+            <w:r>
+              <w:rPr>
+                <w:sz w:val="18"/>
+              </w:rPr>
+            </w:r>
+            <w:r>
+              <w:rPr>
+                <w:b w:val="0"/>
+                <w:i w:val="0"/>
+                <w:sz w:val="18"/>
+                <w:u w:val="none"/>
+              </w:rPr>
+              <w:t>0x5a72cc73…</w:t>
+            </w:r>
+          </w:p>
+        </w:tc>
+      </w:tr>
+    </w:tbl>
+    <w:p/>
+    <w:p>
+      <w:pPr>
+        <w:pStyle w:val="Heading2"/>
+      </w:pPr>
+      <w:r>
+        <w:t>5.10.3 Operator cycle log</w:t>
+      </w:r>
+    </w:p>
+    <w:p>
+      <w:pPr>
+        <w:pStyle w:val="Heading3"/>
+      </w:pPr>
+      <w:r>
+        <w:t>2026-06-07T15-36-04-187Z</w:t>
+      </w:r>
+    </w:p>
+    <w:p>
+      <w:pPr>
+        <w:pStyle w:val="ListBullet"/>
+        <w:ind w:left="0" w:firstLine="0"/>
+      </w:pPr>
+      <w:r>
+        <w:rPr>
+          <w:b/>
+          <w:i w:val="0"/>
+          <w:u w:val="none"/>
+        </w:rPr>
+        <w:t>mint_from_surplus</w:t>
+      </w:r>
+      <w:r>
+        <w:rPr>
+          <w:b w:val="0"/>
+          <w:i w:val="0"/>
+          <w:u w:val="none"/>
+        </w:rPr>
+        <w:t xml:space="preserve"> (100 kWh): 0xcf922f3883f5…</w:t>
+      </w:r>
+    </w:p>
+    <w:p>
+      <w:pPr>
+        <w:pStyle w:val="ListBullet"/>
+        <w:ind w:left="0" w:firstLine="0"/>
+      </w:pPr>
+      <w:r>
+        <w:rPr>
+          <w:b/>
+          <w:i w:val="0"/>
+          <w:u w:val="none"/>
+        </w:rPr>
+        <w:t>network_payment</w:t>
+      </w:r>
+      <w:r>
+        <w:rPr>
+          <w:b w:val="0"/>
+          <w:i w:val="0"/>
+          <w:u w:val="none"/>
+        </w:rPr>
+        <w:t xml:space="preserve"> (8 SPK): 0xeacc17a44e8e…</w:t>
+      </w:r>
+    </w:p>
+    <w:p>
+      <w:pPr>
+        <w:pStyle w:val="ListBullet"/>
+        <w:ind w:left="0" w:firstLine="0"/>
+      </w:pPr>
+      <w:r>
+        <w:rPr>
+          <w:b/>
+          <w:i w:val="0"/>
+          <w:u w:val="none"/>
+        </w:rPr>
+        <w:t>network_payment</w:t>
+      </w:r>
+      <w:r>
+        <w:rPr>
+          <w:b w:val="0"/>
+          <w:i w:val="0"/>
+          <w:u w:val="none"/>
+        </w:rPr>
+        <w:t xml:space="preserve"> (12 SPK): 0xb49728568174…</w:t>
+      </w:r>
+    </w:p>
+    <w:p>
+      <w:pPr>
+        <w:pStyle w:val="ListBullet"/>
+        <w:ind w:left="0" w:firstLine="0"/>
+      </w:pPr>
+      <w:r>
+        <w:rPr>
+          <w:b/>
+          <w:i w:val="0"/>
+          <w:u w:val="none"/>
+        </w:rPr>
+        <w:t>optional_redemption</w:t>
+      </w:r>
+      <w:r>
+        <w:rPr>
+          <w:b w:val="0"/>
+          <w:i w:val="0"/>
+          <w:u w:val="none"/>
+        </w:rPr>
+        <w:t xml:space="preserve"> (5 SPK): 0xabfc4d3462ac…</w:t>
+      </w:r>
+    </w:p>
+    <w:p>
+      <w:pPr>
+        <w:pStyle w:val="Heading3"/>
+      </w:pPr>
+      <w:r>
+        <w:t>2026-06-07T16-02-48-981Z</w:t>
+      </w:r>
+    </w:p>
+    <w:p>
+      <w:pPr>
+        <w:pStyle w:val="ListBullet"/>
+        <w:ind w:left="0" w:firstLine="0"/>
+      </w:pPr>
+      <w:r>
+        <w:rPr>
+          <w:b/>
+          <w:i w:val="0"/>
+          <w:u w:val="none"/>
+        </w:rPr>
+        <w:t>mint_from_attestation</w:t>
+      </w:r>
+      <w:r>
+        <w:rPr>
+          <w:b w:val="0"/>
+          <w:i w:val="0"/>
+          <w:u w:val="none"/>
+        </w:rPr>
+        <w:t xml:space="preserve"> (50 kWh): 0x9fcf885ff5df…</w:t>
+      </w:r>
+    </w:p>
+    <w:p>
+      <w:pPr>
+        <w:pStyle w:val="ListBullet"/>
+        <w:ind w:left="0" w:firstLine="0"/>
+      </w:pPr>
+      <w:r>
+        <w:rPr>
+          <w:b/>
+          <w:i w:val="0"/>
+          <w:u w:val="none"/>
+        </w:rPr>
+        <w:t>network_payment</w:t>
+      </w:r>
+      <w:r>
+        <w:rPr>
+          <w:b w:val="0"/>
+          <w:i w:val="0"/>
+          <w:u w:val="none"/>
+        </w:rPr>
+        <w:t xml:space="preserve"> (6 SPK): 0x7bf526551f5a…</w:t>
+      </w:r>
+    </w:p>
+    <w:p>
+      <w:pPr>
+        <w:pStyle w:val="ListBullet"/>
+        <w:ind w:left="0" w:firstLine="0"/>
+      </w:pPr>
+      <w:r>
+        <w:rPr>
+          <w:b/>
+          <w:i w:val="0"/>
+          <w:u w:val="none"/>
+        </w:rPr>
+        <w:t>network_payment</w:t>
+      </w:r>
+      <w:r>
+        <w:rPr>
+          <w:b w:val="0"/>
+          <w:i w:val="0"/>
+          <w:u w:val="none"/>
+        </w:rPr>
+        <w:t xml:space="preserve"> (10 SPK): 0x1f7cd59612cf…</w:t>
+      </w:r>
+    </w:p>
+    <w:p>
+      <w:pPr>
+        <w:pStyle w:val="ListBullet"/>
+        <w:ind w:left="0" w:firstLine="0"/>
+      </w:pPr>
+      <w:r>
+        <w:rPr>
+          <w:b/>
+          <w:i w:val="0"/>
+          <w:u w:val="none"/>
+        </w:rPr>
+        <w:t>network_payment</w:t>
+      </w:r>
+      <w:r>
+        <w:rPr>
+          <w:b w:val="0"/>
+          <w:i w:val="0"/>
+          <w:u w:val="none"/>
+        </w:rPr>
+        <w:t xml:space="preserve"> (14 SPK): 0x3b912b39ed24…</w:t>
+      </w:r>
+    </w:p>
+    <w:p>
+      <w:pPr>
+        <w:pStyle w:val="ListBullet"/>
+        <w:ind w:left="0" w:firstLine="0"/>
+      </w:pPr>
+      <w:r>
+        <w:rPr>
+          <w:b/>
+          <w:i w:val="0"/>
+          <w:u w:val="none"/>
+        </w:rPr>
+        <w:t>network_payment</w:t>
+      </w:r>
+      <w:r>
+        <w:rPr>
+          <w:b w:val="0"/>
+          <w:i w:val="0"/>
+          <w:u w:val="none"/>
+        </w:rPr>
+        <w:t xml:space="preserve"> (8 SPK): 0x100b4decd5e1…</w:t>
+      </w:r>
+    </w:p>
+    <w:p>
+      <w:pPr>
+        <w:pStyle w:val="ListBullet"/>
+        <w:ind w:left="0" w:firstLine="0"/>
+      </w:pPr>
+      <w:r>
+        <w:rPr>
+          <w:b/>
+          <w:i w:val="0"/>
+          <w:u w:val="none"/>
+        </w:rPr>
+        <w:t>optional_redemption</w:t>
+      </w:r>
+      <w:r>
+        <w:rPr>
+          <w:b w:val="0"/>
+          <w:i w:val="0"/>
+          <w:u w:val="none"/>
+        </w:rPr>
+        <w:t xml:space="preserve"> (5 SPK): 0xd14b9c118ce7…</w:t>
+      </w:r>
+    </w:p>
+    <w:p>
+      <w:pPr>
+        <w:pStyle w:val="Heading3"/>
+      </w:pPr>
+      <w:r>
+        <w:t>2026-06-07T16-25-38-349Z</w:t>
+      </w:r>
+    </w:p>
+    <w:p>
+      <w:pPr>
+        <w:pStyle w:val="ListBullet"/>
+        <w:ind w:left="0" w:firstLine="0"/>
+      </w:pPr>
+      <w:r>
+        <w:rPr>
+          <w:b/>
+          <w:i w:val="0"/>
+          <w:u w:val="none"/>
+        </w:rPr>
+        <w:t>mint_from_attestation</w:t>
+      </w:r>
+      <w:r>
+        <w:rPr>
+          <w:b w:val="0"/>
+          <w:i w:val="0"/>
+          <w:u w:val="none"/>
+        </w:rPr>
+        <w:t xml:space="preserve"> (52 kWh): 0x3527585fd110…</w:t>
+      </w:r>
+    </w:p>
+    <w:p>
+      <w:pPr>
+        <w:pStyle w:val="ListBullet"/>
+        <w:ind w:left="0" w:firstLine="0"/>
+      </w:pPr>
+      <w:r>
+        <w:rPr>
+          <w:b/>
+          <w:i w:val="0"/>
+          <w:u w:val="none"/>
+        </w:rPr>
+        <w:t>network_payment</w:t>
+      </w:r>
+      <w:r>
+        <w:rPr>
+          <w:b w:val="0"/>
+          <w:i w:val="0"/>
+          <w:u w:val="none"/>
+        </w:rPr>
+        <w:t xml:space="preserve"> (6 SPK): 0x7d68647acac4…</w:t>
+      </w:r>
+    </w:p>
+    <w:p>
+      <w:pPr>
+        <w:pStyle w:val="ListBullet"/>
+        <w:ind w:left="0" w:firstLine="0"/>
+      </w:pPr>
+      <w:r>
+        <w:rPr>
+          <w:b/>
+          <w:i w:val="0"/>
+          <w:u w:val="none"/>
+        </w:rPr>
+        <w:t>network_payment</w:t>
+      </w:r>
+      <w:r>
+        <w:rPr>
+          <w:b w:val="0"/>
+          <w:i w:val="0"/>
+          <w:u w:val="none"/>
+        </w:rPr>
+        <w:t xml:space="preserve"> (10 SPK): 0xc1eb24c0dc7e…</w:t>
+      </w:r>
+    </w:p>
+    <w:p>
+      <w:pPr>
+        <w:pStyle w:val="ListBullet"/>
+        <w:ind w:left="0" w:firstLine="0"/>
+      </w:pPr>
+      <w:r>
+        <w:rPr>
+          <w:b/>
+          <w:i w:val="0"/>
+          <w:u w:val="none"/>
+        </w:rPr>
+        <w:t>network_payment</w:t>
+      </w:r>
+      <w:r>
+        <w:rPr>
+          <w:b w:val="0"/>
+          <w:i w:val="0"/>
+          <w:u w:val="none"/>
+        </w:rPr>
+        <w:t xml:space="preserve"> (14 SPK): 0xd01d4ab88396…</w:t>
+      </w:r>
+    </w:p>
+    <w:p>
+      <w:pPr>
+        <w:pStyle w:val="ListBullet"/>
+        <w:ind w:left="0" w:firstLine="0"/>
+      </w:pPr>
+      <w:r>
+        <w:rPr>
+          <w:b/>
+          <w:i w:val="0"/>
+          <w:u w:val="none"/>
+        </w:rPr>
+        <w:t>network_payment</w:t>
+      </w:r>
+      <w:r>
+        <w:rPr>
+          <w:b w:val="0"/>
+          <w:i w:val="0"/>
+          <w:u w:val="none"/>
+        </w:rPr>
+        <w:t xml:space="preserve"> (8 SPK): 0x2b8e8efb9ff2…</w:t>
+      </w:r>
+    </w:p>
+    <w:p>
+      <w:pPr>
+        <w:pStyle w:val="Heading3"/>
+      </w:pPr>
+      <w:r>
+        <w:t>2026-06-08T16-57-04-958Z</w:t>
+      </w:r>
+    </w:p>
+    <w:p>
+      <w:pPr>
+        <w:pStyle w:val="ListBullet"/>
+        <w:ind w:left="0" w:firstLine="0"/>
+      </w:pPr>
+      <w:r>
+        <w:rPr>
+          <w:b/>
+          <w:i w:val="0"/>
+          <w:u w:val="none"/>
+        </w:rPr>
+        <w:t>oracle_refresh</w:t>
+      </w:r>
+      <w:r>
+        <w:rPr>
+          <w:b w:val="0"/>
+          <w:i w:val="0"/>
+          <w:u w:val="none"/>
+        </w:rPr>
+        <w:t>: 0x2b2fff3df582…</w:t>
+      </w:r>
+    </w:p>
+    <w:p>
+      <w:pPr>
+        <w:pStyle w:val="ListBullet"/>
+        <w:ind w:left="0" w:firstLine="0"/>
+      </w:pPr>
+      <w:r>
+        <w:rPr>
+          <w:b/>
+          <w:i w:val="0"/>
+          <w:u w:val="none"/>
+        </w:rPr>
+        <w:t>mint_from_attestation</w:t>
+      </w:r>
+      <w:r>
+        <w:rPr>
+          <w:b w:val="0"/>
+          <w:i w:val="0"/>
+          <w:u w:val="none"/>
+        </w:rPr>
+        <w:t xml:space="preserve"> (50 kWh): 0x3dd63c06a294…</w:t>
+      </w:r>
+    </w:p>
+    <w:p>
+      <w:pPr>
+        <w:pStyle w:val="ListBullet"/>
+        <w:ind w:left="0" w:firstLine="0"/>
+      </w:pPr>
+      <w:r>
+        <w:rPr>
+          <w:b/>
+          <w:i w:val="0"/>
+          <w:u w:val="none"/>
+        </w:rPr>
+        <w:t>network_payment</w:t>
+      </w:r>
+      <w:r>
+        <w:rPr>
+          <w:b w:val="0"/>
+          <w:i w:val="0"/>
+          <w:u w:val="none"/>
+        </w:rPr>
+        <w:t xml:space="preserve"> (6 SPK): 0xfc63cd227940…</w:t>
+      </w:r>
+    </w:p>
+    <w:p>
+      <w:pPr>
+        <w:pStyle w:val="ListBullet"/>
+        <w:ind w:left="0" w:firstLine="0"/>
+      </w:pPr>
+      <w:r>
+        <w:rPr>
+          <w:b/>
+          <w:i w:val="0"/>
+          <w:u w:val="none"/>
+        </w:rPr>
+        <w:t>network_payment</w:t>
+      </w:r>
+      <w:r>
+        <w:rPr>
+          <w:b w:val="0"/>
+          <w:i w:val="0"/>
+          <w:u w:val="none"/>
+        </w:rPr>
+        <w:t xml:space="preserve"> (10 SPK): 0xb620ea8cdcf7…</w:t>
+      </w:r>
+    </w:p>
+    <w:p>
+      <w:pPr>
+        <w:pStyle w:val="ListBullet"/>
+        <w:ind w:left="0" w:firstLine="0"/>
+      </w:pPr>
+      <w:r>
+        <w:rPr>
+          <w:b/>
+          <w:i w:val="0"/>
+          <w:u w:val="none"/>
+        </w:rPr>
+        <w:t>network_payment</w:t>
+      </w:r>
+      <w:r>
+        <w:rPr>
+          <w:b w:val="0"/>
+          <w:i w:val="0"/>
+          <w:u w:val="none"/>
+        </w:rPr>
+        <w:t xml:space="preserve"> (14 SPK): 0x6b1f3801f468…</w:t>
+      </w:r>
+    </w:p>
+    <w:p>
+      <w:pPr>
+        <w:pStyle w:val="ListBullet"/>
+        <w:ind w:left="0" w:firstLine="0"/>
+      </w:pPr>
+      <w:r>
+        <w:rPr>
+          <w:b/>
+          <w:i w:val="0"/>
+          <w:u w:val="none"/>
+        </w:rPr>
+        <w:t>network_payment</w:t>
+      </w:r>
+      <w:r>
+        <w:rPr>
+          <w:b w:val="0"/>
+          <w:i w:val="0"/>
+          <w:u w:val="none"/>
+        </w:rPr>
+        <w:t xml:space="preserve"> (8 SPK): 0x5a72cc73cbc6…</w:t>
+      </w:r>
+    </w:p>
+    <w:p>
+      <w:pPr>
+        <w:pStyle w:val="ListBullet"/>
+        <w:ind w:left="0" w:firstLine="0"/>
+      </w:pPr>
+      <w:r>
+        <w:rPr>
+          <w:b/>
+          <w:i w:val="0"/>
+          <w:u w:val="none"/>
+        </w:rPr>
+        <w:t>optional_redemption</w:t>
+      </w:r>
+      <w:r>
+        <w:rPr>
+          <w:b w:val="0"/>
+          <w:i w:val="0"/>
+          <w:u w:val="none"/>
+        </w:rPr>
+        <w:t xml:space="preserve"> (5 SPK): 0xf3111ce6742e…</w:t>
       </w:r>
     </w:p>
     <w:p>

</xml_diff>

<commit_message>
Fix thesis DOCX export quality issues found in audit.
Correct evidence metadata formatting, heading levels, duplicate metrics, reference dedupe, and chapter-only Word files.

Co-authored-by: Cursor <cursoragent@cursor.com>
</commit_message>
<xml_diff>
--- a/thesis_package/output/THESIS_GROUNDED.docx
+++ b/thesis_package/output/THESIS_GROUNDED.docx
@@ -9172,84 +9172,6 @@
     <w:p>
       <w:r>
         <w:rPr>
-          <w:b w:val="0"/>
-          <w:i w:val="0"/>
-          <w:u w:val="none"/>
-        </w:rPr>
-        <w:t xml:space="preserve">Synced metrics (Jun 2026): ~5,499 SPK supply, 442 SPK settled, </w:t>
-      </w:r>
-      <w:r>
-        <w:rPr>
-          <w:b/>
-          <w:i w:val="0"/>
-          <w:u w:val="none"/>
-        </w:rPr>
-        <w:t>21</w:t>
-      </w:r>
-      <w:r>
-        <w:rPr>
-          <w:b w:val="0"/>
-          <w:i w:val="0"/>
-          <w:u w:val="none"/>
-        </w:rPr>
-        <w:t xml:space="preserve"> network payments, 96.7% circulation share. Payment </w:t>
-      </w:r>
-      <w:r>
-        <w:rPr>
-          <w:b/>
-          <w:i w:val="0"/>
-          <w:u w:val="none"/>
-        </w:rPr>
-        <w:t>#15</w:t>
-      </w:r>
-      <w:r>
-        <w:rPr>
-          <w:b w:val="0"/>
-          <w:i w:val="0"/>
-          <w:u w:val="none"/>
-        </w:rPr>
-        <w:t xml:space="preserve"> is a wallet-initiated pilot transfer (Pilot payer → Merchant, 5 SPK). Reproduce: </w:t>
-      </w:r>
-      <w:r>
-        <w:rPr>
-          <w:rFonts w:ascii="Courier New" w:hAnsi="Courier New"/>
-          <w:b w:val="0"/>
-          <w:i w:val="0"/>
-          <w:sz w:val="21"/>
-          <w:u w:val="none"/>
-        </w:rPr>
-        <w:t>npm run foundation:sync</w:t>
-      </w:r>
-      <w:r>
-        <w:rPr>
-          <w:b w:val="0"/>
-          <w:i w:val="0"/>
-          <w:u w:val="none"/>
-        </w:rPr>
-        <w:t xml:space="preserve"> or </w:t>
-      </w:r>
-      <w:r>
-        <w:rPr>
-          <w:rFonts w:ascii="Courier New" w:hAnsi="Courier New"/>
-          <w:b w:val="0"/>
-          <w:i w:val="0"/>
-          <w:sz w:val="21"/>
-          <w:u w:val="none"/>
-        </w:rPr>
-        <w:t>spk-v1 sync --repo-root .</w:t>
-      </w:r>
-      <w:r>
-        <w:rPr>
-          <w:b w:val="0"/>
-          <w:i w:val="0"/>
-          <w:u w:val="none"/>
-        </w:rPr>
-        <w:t>.</w:t>
-      </w:r>
-    </w:p>
-    <w:p>
-      <w:r>
-        <w:rPr>
           <w:b/>
           <w:i w:val="0"/>
           <w:u w:val="none"/>
@@ -9322,12 +9244,12 @@
           <w:i/>
           <w:u w:val="none"/>
         </w:rPr>
-        <w:t xml:space="preserve"> after Sepolia sync (Generated:** 2026-06-09T09:53:51.664666+00:00).</w:t>
+        <w:t xml:space="preserve"> after Sepolia sync (generated 2026-06-09T10:03:54.491830+00:00).</w:t>
       </w:r>
     </w:p>
     <w:p>
       <w:pPr>
-        <w:pStyle w:val="Heading2"/>
+        <w:pStyle w:val="Heading3"/>
       </w:pPr>
       <w:r>
         <w:t>5.10.1 Canonical contracts and live metrics</w:t>
@@ -9583,7 +9505,7 @@
     </w:p>
     <w:p>
       <w:pPr>
-        <w:pStyle w:val="Heading2"/>
+        <w:pStyle w:val="Heading3"/>
       </w:pPr>
       <w:r>
         <w:t>5.10.2 Indexed payment ledger (Table 5.4)</w:t>
@@ -12873,7 +12795,7 @@
     <w:p/>
     <w:p>
       <w:pPr>
-        <w:pStyle w:val="Heading2"/>
+        <w:pStyle w:val="Heading3"/>
       </w:pPr>
       <w:r>
         <w:t>5.10.3 Operator cycle log</w:t>
@@ -12881,7 +12803,7 @@
     </w:p>
     <w:p>
       <w:pPr>
-        <w:pStyle w:val="Heading3"/>
+        <w:pStyle w:val="Heading4"/>
       </w:pPr>
       <w:r>
         <w:t>2026-06-07T15-36-04-187Z</w:t>
@@ -12977,7 +12899,7 @@
     </w:p>
     <w:p>
       <w:pPr>
-        <w:pStyle w:val="Heading3"/>
+        <w:pStyle w:val="Heading4"/>
       </w:pPr>
       <w:r>
         <w:t>2026-06-07T16-02-48-981Z</w:t>
@@ -13117,7 +13039,7 @@
     </w:p>
     <w:p>
       <w:pPr>
-        <w:pStyle w:val="Heading3"/>
+        <w:pStyle w:val="Heading4"/>
       </w:pPr>
       <w:r>
         <w:t>2026-06-07T16-25-38-349Z</w:t>
@@ -13235,7 +13157,7 @@
     </w:p>
     <w:p>
       <w:pPr>
-        <w:pStyle w:val="Heading3"/>
+        <w:pStyle w:val="Heading4"/>
       </w:pPr>
       <w:r>
         <w:t>2026-06-08T16-57-04-958Z</w:t>
@@ -14513,32 +14435,6 @@
           <w:u w:val="none"/>
         </w:rPr>
         <w:t xml:space="preserve">Cambridge Centre for Alternative Finance. (n.d.). </w:t>
-      </w:r>
-      <w:r>
-        <w:rPr>
-          <w:b w:val="0"/>
-          <w:i/>
-          <w:u w:val="none"/>
-        </w:rPr>
-        <w:t>Cambridge Bitcoin Electricity Consumption Index</w:t>
-      </w:r>
-      <w:r>
-        <w:rPr>
-          <w:b w:val="0"/>
-          <w:i w:val="0"/>
-          <w:u w:val="none"/>
-        </w:rPr>
-        <w:t>. Cambridge Judge Business School. https://ccaf.io/cbnsi/cbeci</w:t>
-      </w:r>
-    </w:p>
-    <w:p>
-      <w:r>
-        <w:rPr>
-          <w:b w:val="0"/>
-          <w:i w:val="0"/>
-          <w:u w:val="none"/>
-        </w:rPr>
-        <w:t xml:space="preserve">Cambridge Centre for Alternative Finance. (n.d.-a). </w:t>
       </w:r>
       <w:r>
         <w:rPr>

</xml_diff>